<commit_message>
feat: add font theme
</commit_message>
<xml_diff>
--- a/tests/markdown.docx
+++ b/tests/markdown.docx
@@ -927,7 +927,7 @@
       <w:r>
         <w:t xml:space="preserve">@mentions, #refs, </w:t>
       </w:r>
-      <w:hyperlink w:history="1" r:id="rIdej9mqm4bblps9rbzibaxo">
+      <w:hyperlink w:history="1" r:id="rIddlwaqbnn5xdlsxboikftc">
         <w:r>
           <w:rPr>
             <w:rStyle w:val="MdLink"/>
@@ -1152,7 +1152,7 @@
       <w:pPr>
         <w:pStyle w:val="MdParagraph"/>
       </w:pPr>
-      <w:hyperlink w:history="1" r:id="rId1tvauvivoeyg2j5skzif5">
+      <w:hyperlink w:history="1" r:id="rIdxrbyy2jya6calp527lb-e">
         <w:r>
           <w:rPr>
             <w:rStyle w:val="MdLink"/>
@@ -1170,7 +1170,7 @@
       <w:pPr>
         <w:pStyle w:val="MdParagraph"/>
       </w:pPr>
-      <w:hyperlink w:history="1" r:id="rIdxowmkvljcqajgfero7kn4">
+      <w:hyperlink w:history="1" r:id="rIdxjyzhmdeyxtttxx28sslm">
         <w:r>
           <w:rPr>
             <w:rStyle w:val="MdLink"/>
@@ -1188,7 +1188,7 @@
       <w:pPr>
         <w:pStyle w:val="MdParagraph"/>
       </w:pPr>
-      <w:hyperlink w:history="1" r:id="rIddg5h_hmd9hdls3ajvmpfr">
+      <w:hyperlink w:history="1" r:id="rIdetopq-du_a1hagu9xck2s">
         <w:r>
           <w:rPr>
             <w:rStyle w:val="MdLink"/>
@@ -1206,7 +1206,7 @@
       <w:pPr>
         <w:pStyle w:val="MdParagraph"/>
       </w:pPr>
-      <w:hyperlink w:history="1" r:id="rIdcyxwobyimr8qjslwwjce9">
+      <w:hyperlink w:history="1" r:id="rIdawd_bnnvoxcqsm2xp_fid">
         <w:r>
           <w:rPr>
             <w:rStyle w:val="MdLink"/>
@@ -1224,7 +1224,7 @@
       <w:pPr>
         <w:pStyle w:val="MdParagraph"/>
       </w:pPr>
-      <w:hyperlink w:history="1" r:id="rIdsku5mb50cmgqg9lexikac">
+      <w:hyperlink w:history="1" r:id="rIdeqysilbpjmowemj7zuxdg">
         <w:r>
           <w:rPr>
             <w:rStyle w:val="MdLink"/>
@@ -1245,7 +1245,7 @@
       <w:r>
         <w:t xml:space="preserve">Or leave it empty and use the </w:t>
       </w:r>
-      <w:hyperlink w:history="1" r:id="rIddf8379hmyvj32t28qs0c5">
+      <w:hyperlink w:history="1" r:id="rId2yb0qwkr0fewzzip4pddq">
         <w:r>
           <w:rPr>
             <w:rStyle w:val="MdLink"/>
@@ -1270,7 +1270,7 @@
         <w:t xml:space="preserve">URLs and URLs in angle brackets will automatically get turned into links.
 </w:t>
       </w:r>
-      <w:hyperlink w:history="1" r:id="rIdn12vvpfmp5b3440mdsmrw">
+      <w:hyperlink w:history="1" r:id="rIdhxmeinnxsnhwcbpy8w2tn">
         <w:r>
           <w:rPr>
             <w:rStyle w:val="MdLink"/>
@@ -1281,7 +1281,7 @@
       <w:r>
         <w:t xml:space="preserve"> or </w:t>
       </w:r>
-      <w:hyperlink w:history="1" r:id="rIdrmlesw4n4ocgxp2fm3xbl">
+      <w:hyperlink w:history="1" r:id="rIdlee8mfz7q8v71ca-v9z6p">
         <w:r>
           <w:rPr>
             <w:rStyle w:val="MdLink"/>
@@ -1747,7 +1747,7 @@
         <w:pStyle w:val="Heading1"/>
         <w:pStyle w:val="MdHeading1"/>
       </w:pPr>
-      <w:hyperlink w:history="1" r:id="rIdhedo7vejke8zspjca1jam">
+      <w:hyperlink w:history="1" r:id="rId1pvmmkyruh9rccdlbh7kh">
         <w:r>
           <w:rPr>
             <w:rStyle w:val="MdLink"/>

</xml_diff>

<commit_message>
feat: add image horizontal align theme
</commit_message>
<xml_diff>
--- a/tests/markdown.docx
+++ b/tests/markdown.docx
@@ -927,7 +927,7 @@
       <w:r>
         <w:t xml:space="preserve">@mentions, #refs, </w:t>
       </w:r>
-      <w:hyperlink w:history="1" r:id="rIddlwaqbnn5xdlsxboikftc">
+      <w:hyperlink w:history="1" r:id="rIdlvknff6cygb5dkaeze74c">
         <w:r>
           <w:rPr>
             <w:rStyle w:val="MdLink"/>
@@ -1152,7 +1152,7 @@
       <w:pPr>
         <w:pStyle w:val="MdParagraph"/>
       </w:pPr>
-      <w:hyperlink w:history="1" r:id="rIdxrbyy2jya6calp527lb-e">
+      <w:hyperlink w:history="1" r:id="rIdqdwswjue9vnoibkund59l">
         <w:r>
           <w:rPr>
             <w:rStyle w:val="MdLink"/>
@@ -1170,7 +1170,7 @@
       <w:pPr>
         <w:pStyle w:val="MdParagraph"/>
       </w:pPr>
-      <w:hyperlink w:history="1" r:id="rIdxjyzhmdeyxtttxx28sslm">
+      <w:hyperlink w:history="1" r:id="rIdurjflq55pngennbsjnw2x">
         <w:r>
           <w:rPr>
             <w:rStyle w:val="MdLink"/>
@@ -1188,7 +1188,7 @@
       <w:pPr>
         <w:pStyle w:val="MdParagraph"/>
       </w:pPr>
-      <w:hyperlink w:history="1" r:id="rIdetopq-du_a1hagu9xck2s">
+      <w:hyperlink w:history="1" r:id="rIdmd-htyfhyww5zorenfolg">
         <w:r>
           <w:rPr>
             <w:rStyle w:val="MdLink"/>
@@ -1206,7 +1206,7 @@
       <w:pPr>
         <w:pStyle w:val="MdParagraph"/>
       </w:pPr>
-      <w:hyperlink w:history="1" r:id="rIdawd_bnnvoxcqsm2xp_fid">
+      <w:hyperlink w:history="1" r:id="rId7guef8mbyd5a6p1fuyzkj">
         <w:r>
           <w:rPr>
             <w:rStyle w:val="MdLink"/>
@@ -1224,7 +1224,7 @@
       <w:pPr>
         <w:pStyle w:val="MdParagraph"/>
       </w:pPr>
-      <w:hyperlink w:history="1" r:id="rIdeqysilbpjmowemj7zuxdg">
+      <w:hyperlink w:history="1" r:id="rId6spej09yqiloxm-nst9gs">
         <w:r>
           <w:rPr>
             <w:rStyle w:val="MdLink"/>
@@ -1245,7 +1245,7 @@
       <w:r>
         <w:t xml:space="preserve">Or leave it empty and use the </w:t>
       </w:r>
-      <w:hyperlink w:history="1" r:id="rId2yb0qwkr0fewzzip4pddq">
+      <w:hyperlink w:history="1" r:id="rIdzzmumb5y_uyovbtlh3hgq">
         <w:r>
           <w:rPr>
             <w:rStyle w:val="MdLink"/>
@@ -1270,7 +1270,7 @@
         <w:t xml:space="preserve">URLs and URLs in angle brackets will automatically get turned into links.
 </w:t>
       </w:r>
-      <w:hyperlink w:history="1" r:id="rIdhxmeinnxsnhwcbpy8w2tn">
+      <w:hyperlink w:history="1" r:id="rIdxzspj5axmubo8autzuklw">
         <w:r>
           <w:rPr>
             <w:rStyle w:val="MdLink"/>
@@ -1281,7 +1281,7 @@
       <w:r>
         <w:t xml:space="preserve"> or </w:t>
       </w:r>
-      <w:hyperlink w:history="1" r:id="rIdlee8mfz7q8v71ca-v9z6p">
+      <w:hyperlink w:history="1" r:id="rIdonuf86zq-szsoxxis77tm">
         <w:r>
           <w:rPr>
             <w:rStyle w:val="MdLink"/>
@@ -1358,46 +1358,51 @@
         <w:t xml:space="preserve">Inline-style:
 </w:t>
       </w:r>
-      <w:r>
-        <w:drawing>
-          <wp:inline distT="0" distB="0" distL="0" distR="0">
-            <wp:extent cx="990600" cy="1200150"/>
-            <wp:effectExtent t="0" r="0" b="0" l="0"/>
-            <wp:docPr id="1" name="alt text" descr="alt text" title="Logo Title Text 1"/>
-            <wp:cNvGraphicFramePr>
-              <a:graphicFrameLocks xmlns:a="http://schemas.openxmlformats.org/drawingml/2006/main" noChangeAspect="1"/>
-            </wp:cNvGraphicFramePr>
-            <a:graphic xmlns:a="http://schemas.openxmlformats.org/drawingml/2006/main">
-              <a:graphicData uri="http://schemas.openxmlformats.org/drawingml/2006/picture">
-                <pic:pic xmlns:pic="http://schemas.openxmlformats.org/drawingml/2006/picture">
-                  <pic:nvPicPr>
-                    <pic:cNvPr id="0" name="" descr=""/>
-                    <pic:cNvPicPr>
-                      <a:picLocks noChangeAspect="1" noChangeArrowheads="1"/>
-                    </pic:cNvPicPr>
-                  </pic:nvPicPr>
-                  <pic:blipFill>
-                    <a:blip r:embed="rId6" cstate="none"/>
-                    <a:srcRect/>
-                    <a:stretch>
-                      <a:fillRect/>
-                    </a:stretch>
-                  </pic:blipFill>
-                  <pic:spPr bwMode="auto">
-                    <a:xfrm>
-                      <a:off x="0" y="0"/>
-                      <a:ext cx="990600" cy="1200150"/>
-                    </a:xfrm>
-                    <a:prstGeom prst="rect">
-                      <a:avLst/>
-                    </a:prstGeom>
-                  </pic:spPr>
-                </pic:pic>
-              </a:graphicData>
-            </a:graphic>
-          </wp:inline>
-        </w:drawing>
-      </w:r>
+      <w:p>
+        <w:pPr>
+          <w:jc w:val="center"/>
+        </w:pPr>
+        <w:r>
+          <w:drawing>
+            <wp:inline distT="0" distB="0" distL="0" distR="0">
+              <wp:extent cx="990600" cy="1200150"/>
+              <wp:effectExtent t="0" r="0" b="0" l="0"/>
+              <wp:docPr id="1" name="alt text" descr="alt text" title="Logo Title Text 1"/>
+              <wp:cNvGraphicFramePr>
+                <a:graphicFrameLocks xmlns:a="http://schemas.openxmlformats.org/drawingml/2006/main" noChangeAspect="1"/>
+              </wp:cNvGraphicFramePr>
+              <a:graphic xmlns:a="http://schemas.openxmlformats.org/drawingml/2006/main">
+                <a:graphicData uri="http://schemas.openxmlformats.org/drawingml/2006/picture">
+                  <pic:pic xmlns:pic="http://schemas.openxmlformats.org/drawingml/2006/picture">
+                    <pic:nvPicPr>
+                      <pic:cNvPr id="0" name="" descr=""/>
+                      <pic:cNvPicPr>
+                        <a:picLocks noChangeAspect="1" noChangeArrowheads="1"/>
+                      </pic:cNvPicPr>
+                    </pic:nvPicPr>
+                    <pic:blipFill>
+                      <a:blip r:embed="rId6" cstate="none"/>
+                      <a:srcRect/>
+                      <a:stretch>
+                        <a:fillRect/>
+                      </a:stretch>
+                    </pic:blipFill>
+                    <pic:spPr bwMode="auto">
+                      <a:xfrm>
+                        <a:off x="0" y="0"/>
+                        <a:ext cx="990600" cy="1200150"/>
+                      </a:xfrm>
+                      <a:prstGeom prst="rect">
+                        <a:avLst/>
+                      </a:prstGeom>
+                    </pic:spPr>
+                  </pic:pic>
+                </a:graphicData>
+              </a:graphic>
+            </wp:inline>
+          </w:drawing>
+        </w:r>
+      </w:p>
     </w:p>
     <w:p>
       <w:pPr>
@@ -1412,46 +1417,51 @@
         <w:t xml:space="preserve">Reference-style:
 </w:t>
       </w:r>
-      <w:r>
-        <w:drawing>
-          <wp:inline distT="0" distB="0" distL="0" distR="0">
-            <wp:extent cx="990600" cy="1200150"/>
-            <wp:effectExtent t="0" r="0" b="0" l="0"/>
-            <wp:docPr id="1" name="alt text" descr="alt text" title="Logo Title Text 2"/>
-            <wp:cNvGraphicFramePr>
-              <a:graphicFrameLocks xmlns:a="http://schemas.openxmlformats.org/drawingml/2006/main" noChangeAspect="1"/>
-            </wp:cNvGraphicFramePr>
-            <a:graphic xmlns:a="http://schemas.openxmlformats.org/drawingml/2006/main">
-              <a:graphicData uri="http://schemas.openxmlformats.org/drawingml/2006/picture">
-                <pic:pic xmlns:pic="http://schemas.openxmlformats.org/drawingml/2006/picture">
-                  <pic:nvPicPr>
-                    <pic:cNvPr id="0" name="" descr=""/>
-                    <pic:cNvPicPr>
-                      <a:picLocks noChangeAspect="1" noChangeArrowheads="1"/>
-                    </pic:cNvPicPr>
-                  </pic:nvPicPr>
-                  <pic:blipFill>
-                    <a:blip r:embed="rId6" cstate="none"/>
-                    <a:srcRect/>
-                    <a:stretch>
-                      <a:fillRect/>
-                    </a:stretch>
-                  </pic:blipFill>
-                  <pic:spPr bwMode="auto">
-                    <a:xfrm>
-                      <a:off x="0" y="0"/>
-                      <a:ext cx="990600" cy="1200150"/>
-                    </a:xfrm>
-                    <a:prstGeom prst="rect">
-                      <a:avLst/>
-                    </a:prstGeom>
-                  </pic:spPr>
-                </pic:pic>
-              </a:graphicData>
-            </a:graphic>
-          </wp:inline>
-        </w:drawing>
-      </w:r>
+      <w:p>
+        <w:pPr>
+          <w:jc w:val="center"/>
+        </w:pPr>
+        <w:r>
+          <w:drawing>
+            <wp:inline distT="0" distB="0" distL="0" distR="0">
+              <wp:extent cx="990600" cy="1200150"/>
+              <wp:effectExtent t="0" r="0" b="0" l="0"/>
+              <wp:docPr id="1" name="alt text" descr="alt text" title="Logo Title Text 2"/>
+              <wp:cNvGraphicFramePr>
+                <a:graphicFrameLocks xmlns:a="http://schemas.openxmlformats.org/drawingml/2006/main" noChangeAspect="1"/>
+              </wp:cNvGraphicFramePr>
+              <a:graphic xmlns:a="http://schemas.openxmlformats.org/drawingml/2006/main">
+                <a:graphicData uri="http://schemas.openxmlformats.org/drawingml/2006/picture">
+                  <pic:pic xmlns:pic="http://schemas.openxmlformats.org/drawingml/2006/picture">
+                    <pic:nvPicPr>
+                      <pic:cNvPr id="0" name="" descr=""/>
+                      <pic:cNvPicPr>
+                        <a:picLocks noChangeAspect="1" noChangeArrowheads="1"/>
+                      </pic:cNvPicPr>
+                    </pic:nvPicPr>
+                    <pic:blipFill>
+                      <a:blip r:embed="rId6" cstate="none"/>
+                      <a:srcRect/>
+                      <a:stretch>
+                        <a:fillRect/>
+                      </a:stretch>
+                    </pic:blipFill>
+                    <pic:spPr bwMode="auto">
+                      <a:xfrm>
+                        <a:off x="0" y="0"/>
+                        <a:ext cx="990600" cy="1200150"/>
+                      </a:xfrm>
+                      <a:prstGeom prst="rect">
+                        <a:avLst/>
+                      </a:prstGeom>
+                    </pic:spPr>
+                  </pic:pic>
+                </a:graphicData>
+              </a:graphic>
+            </wp:inline>
+          </w:drawing>
+        </w:r>
+      </w:p>
     </w:p>
     <w:p>
       <w:pPr>
@@ -1462,90 +1472,100 @@
       <w:pPr>
         <w:pStyle w:val="MdParagraph"/>
       </w:pPr>
-      <w:r>
-        <w:drawing>
-          <wp:inline distT="0" distB="0" distL="0" distR="0">
-            <wp:extent cx="4152900" cy="1181100"/>
-            <wp:effectExtent t="0" r="0" b="0" l="0"/>
-            <wp:docPr id="1" name="Minion" descr="Minion" title="Minion"/>
-            <wp:cNvGraphicFramePr>
-              <a:graphicFrameLocks xmlns:a="http://schemas.openxmlformats.org/drawingml/2006/main" noChangeAspect="1"/>
-            </wp:cNvGraphicFramePr>
-            <a:graphic xmlns:a="http://schemas.openxmlformats.org/drawingml/2006/main">
-              <a:graphicData uri="http://schemas.openxmlformats.org/drawingml/2006/picture">
-                <pic:pic xmlns:pic="http://schemas.openxmlformats.org/drawingml/2006/picture">
-                  <pic:nvPicPr>
-                    <pic:cNvPr id="0" name="" descr=""/>
-                    <pic:cNvPicPr>
-                      <a:picLocks noChangeAspect="1" noChangeArrowheads="1"/>
-                    </pic:cNvPicPr>
-                  </pic:nvPicPr>
-                  <pic:blipFill>
-                    <a:blip r:embed="rId7" cstate="none"/>
-                    <a:srcRect/>
-                    <a:stretch>
-                      <a:fillRect/>
-                    </a:stretch>
-                  </pic:blipFill>
-                  <pic:spPr bwMode="auto">
-                    <a:xfrm>
-                      <a:off x="0" y="0"/>
-                      <a:ext cx="4152900" cy="1181100"/>
-                    </a:xfrm>
-                    <a:prstGeom prst="rect">
-                      <a:avLst/>
-                    </a:prstGeom>
-                  </pic:spPr>
-                </pic:pic>
-              </a:graphicData>
-            </a:graphic>
-          </wp:inline>
-        </w:drawing>
-      </w:r>
+      <w:p>
+        <w:pPr>
+          <w:jc w:val="center"/>
+        </w:pPr>
+        <w:r>
+          <w:drawing>
+            <wp:inline distT="0" distB="0" distL="0" distR="0">
+              <wp:extent cx="4152900" cy="1181100"/>
+              <wp:effectExtent t="0" r="0" b="0" l="0"/>
+              <wp:docPr id="1" name="Minion" descr="Minion" title="Minion"/>
+              <wp:cNvGraphicFramePr>
+                <a:graphicFrameLocks xmlns:a="http://schemas.openxmlformats.org/drawingml/2006/main" noChangeAspect="1"/>
+              </wp:cNvGraphicFramePr>
+              <a:graphic xmlns:a="http://schemas.openxmlformats.org/drawingml/2006/main">
+                <a:graphicData uri="http://schemas.openxmlformats.org/drawingml/2006/picture">
+                  <pic:pic xmlns:pic="http://schemas.openxmlformats.org/drawingml/2006/picture">
+                    <pic:nvPicPr>
+                      <pic:cNvPr id="0" name="" descr=""/>
+                      <pic:cNvPicPr>
+                        <a:picLocks noChangeAspect="1" noChangeArrowheads="1"/>
+                      </pic:cNvPicPr>
+                    </pic:nvPicPr>
+                    <pic:blipFill>
+                      <a:blip r:embed="rId7" cstate="none"/>
+                      <a:srcRect/>
+                      <a:stretch>
+                        <a:fillRect/>
+                      </a:stretch>
+                    </pic:blipFill>
+                    <pic:spPr bwMode="auto">
+                      <a:xfrm>
+                        <a:off x="0" y="0"/>
+                        <a:ext cx="4152900" cy="1181100"/>
+                      </a:xfrm>
+                      <a:prstGeom prst="rect">
+                        <a:avLst/>
+                      </a:prstGeom>
+                    </pic:spPr>
+                  </pic:pic>
+                </a:graphicData>
+              </a:graphic>
+            </wp:inline>
+          </w:drawing>
+        </w:r>
+      </w:p>
       <w:r>
         <w:t xml:space="preserve">
 </w:t>
       </w:r>
-      <w:r>
-        <w:drawing>
-          <wp:inline distT="0" distB="0" distL="0" distR="0">
-            <wp:extent cx="1066800" cy="1066800"/>
-            <wp:effectExtent t="0" r="0" b="0" l="0"/>
-            <wp:docPr id="1" name="Stormtroopocat" descr="Stormtroopocat" title="The Stormtroopocat"/>
-            <wp:cNvGraphicFramePr>
-              <a:graphicFrameLocks xmlns:a="http://schemas.openxmlformats.org/drawingml/2006/main" noChangeAspect="1"/>
-            </wp:cNvGraphicFramePr>
-            <a:graphic xmlns:a="http://schemas.openxmlformats.org/drawingml/2006/main">
-              <a:graphicData uri="http://schemas.openxmlformats.org/drawingml/2006/picture">
-                <pic:pic xmlns:pic="http://schemas.openxmlformats.org/drawingml/2006/picture">
-                  <pic:nvPicPr>
-                    <pic:cNvPr id="0" name="" descr=""/>
-                    <pic:cNvPicPr>
-                      <a:picLocks noChangeAspect="1" noChangeArrowheads="1"/>
-                    </pic:cNvPicPr>
-                  </pic:nvPicPr>
-                  <pic:blipFill>
-                    <a:blip r:embed="rId8" cstate="none"/>
-                    <a:srcRect/>
-                    <a:stretch>
-                      <a:fillRect/>
-                    </a:stretch>
-                  </pic:blipFill>
-                  <pic:spPr bwMode="auto">
-                    <a:xfrm>
-                      <a:off x="0" y="0"/>
-                      <a:ext cx="1066800" cy="1066800"/>
-                    </a:xfrm>
-                    <a:prstGeom prst="rect">
-                      <a:avLst/>
-                    </a:prstGeom>
-                  </pic:spPr>
-                </pic:pic>
-              </a:graphicData>
-            </a:graphic>
-          </wp:inline>
-        </w:drawing>
-      </w:r>
+      <w:p>
+        <w:pPr>
+          <w:jc w:val="center"/>
+        </w:pPr>
+        <w:r>
+          <w:drawing>
+            <wp:inline distT="0" distB="0" distL="0" distR="0">
+              <wp:extent cx="1066800" cy="1066800"/>
+              <wp:effectExtent t="0" r="0" b="0" l="0"/>
+              <wp:docPr id="1" name="Stormtroopocat" descr="Stormtroopocat" title="The Stormtroopocat"/>
+              <wp:cNvGraphicFramePr>
+                <a:graphicFrameLocks xmlns:a="http://schemas.openxmlformats.org/drawingml/2006/main" noChangeAspect="1"/>
+              </wp:cNvGraphicFramePr>
+              <a:graphic xmlns:a="http://schemas.openxmlformats.org/drawingml/2006/main">
+                <a:graphicData uri="http://schemas.openxmlformats.org/drawingml/2006/picture">
+                  <pic:pic xmlns:pic="http://schemas.openxmlformats.org/drawingml/2006/picture">
+                    <pic:nvPicPr>
+                      <pic:cNvPr id="0" name="" descr=""/>
+                      <pic:cNvPicPr>
+                        <a:picLocks noChangeAspect="1" noChangeArrowheads="1"/>
+                      </pic:cNvPicPr>
+                    </pic:nvPicPr>
+                    <pic:blipFill>
+                      <a:blip r:embed="rId8" cstate="none"/>
+                      <a:srcRect/>
+                      <a:stretch>
+                        <a:fillRect/>
+                      </a:stretch>
+                    </pic:blipFill>
+                    <pic:spPr bwMode="auto">
+                      <a:xfrm>
+                        <a:off x="0" y="0"/>
+                        <a:ext cx="1066800" cy="1066800"/>
+                      </a:xfrm>
+                      <a:prstGeom prst="rect">
+                        <a:avLst/>
+                      </a:prstGeom>
+                    </pic:spPr>
+                  </pic:pic>
+                </a:graphicData>
+              </a:graphic>
+            </wp:inline>
+          </w:drawing>
+        </w:r>
+      </w:p>
     </w:p>
     <w:p>
       <w:pPr>
@@ -1569,46 +1589,51 @@
       <w:pPr>
         <w:pStyle w:val="MdParagraph"/>
       </w:pPr>
-      <w:r>
-        <w:drawing>
-          <wp:inline distT="0" distB="0" distL="0" distR="0">
-            <wp:extent cx="1066800" cy="1066800"/>
-            <wp:effectExtent t="0" r="0" b="0" l="0"/>
-            <wp:docPr id="1" name="Alt text" descr="Alt text" title="The Dojocat"/>
-            <wp:cNvGraphicFramePr>
-              <a:graphicFrameLocks xmlns:a="http://schemas.openxmlformats.org/drawingml/2006/main" noChangeAspect="1"/>
-            </wp:cNvGraphicFramePr>
-            <a:graphic xmlns:a="http://schemas.openxmlformats.org/drawingml/2006/main">
-              <a:graphicData uri="http://schemas.openxmlformats.org/drawingml/2006/picture">
-                <pic:pic xmlns:pic="http://schemas.openxmlformats.org/drawingml/2006/picture">
-                  <pic:nvPicPr>
-                    <pic:cNvPr id="0" name="" descr=""/>
-                    <pic:cNvPicPr>
-                      <a:picLocks noChangeAspect="1" noChangeArrowheads="1"/>
-                    </pic:cNvPicPr>
-                  </pic:nvPicPr>
-                  <pic:blipFill>
-                    <a:blip r:embed="rId8" cstate="none"/>
-                    <a:srcRect/>
-                    <a:stretch>
-                      <a:fillRect/>
-                    </a:stretch>
-                  </pic:blipFill>
-                  <pic:spPr bwMode="auto">
-                    <a:xfrm>
-                      <a:off x="0" y="0"/>
-                      <a:ext cx="1066800" cy="1066800"/>
-                    </a:xfrm>
-                    <a:prstGeom prst="rect">
-                      <a:avLst/>
-                    </a:prstGeom>
-                  </pic:spPr>
-                </pic:pic>
-              </a:graphicData>
-            </a:graphic>
-          </wp:inline>
-        </w:drawing>
-      </w:r>
+      <w:p>
+        <w:pPr>
+          <w:jc w:val="center"/>
+        </w:pPr>
+        <w:r>
+          <w:drawing>
+            <wp:inline distT="0" distB="0" distL="0" distR="0">
+              <wp:extent cx="1066800" cy="1066800"/>
+              <wp:effectExtent t="0" r="0" b="0" l="0"/>
+              <wp:docPr id="1" name="Alt text" descr="Alt text" title="The Dojocat"/>
+              <wp:cNvGraphicFramePr>
+                <a:graphicFrameLocks xmlns:a="http://schemas.openxmlformats.org/drawingml/2006/main" noChangeAspect="1"/>
+              </wp:cNvGraphicFramePr>
+              <a:graphic xmlns:a="http://schemas.openxmlformats.org/drawingml/2006/main">
+                <a:graphicData uri="http://schemas.openxmlformats.org/drawingml/2006/picture">
+                  <pic:pic xmlns:pic="http://schemas.openxmlformats.org/drawingml/2006/picture">
+                    <pic:nvPicPr>
+                      <pic:cNvPr id="0" name="" descr=""/>
+                      <pic:cNvPicPr>
+                        <a:picLocks noChangeAspect="1" noChangeArrowheads="1"/>
+                      </pic:cNvPicPr>
+                    </pic:nvPicPr>
+                    <pic:blipFill>
+                      <a:blip r:embed="rId8" cstate="none"/>
+                      <a:srcRect/>
+                      <a:stretch>
+                        <a:fillRect/>
+                      </a:stretch>
+                    </pic:blipFill>
+                    <pic:spPr bwMode="auto">
+                      <a:xfrm>
+                        <a:off x="0" y="0"/>
+                        <a:ext cx="1066800" cy="1066800"/>
+                      </a:xfrm>
+                      <a:prstGeom prst="rect">
+                        <a:avLst/>
+                      </a:prstGeom>
+                    </pic:spPr>
+                  </pic:pic>
+                </a:graphicData>
+              </a:graphic>
+            </wp:inline>
+          </w:drawing>
+        </w:r>
+      </w:p>
     </w:p>
     <w:p>
       <w:pPr>
@@ -1650,46 +1675,51 @@
       <w:pPr>
         <w:pStyle w:val="MdParagraph"/>
       </w:pPr>
-      <w:r>
-        <w:drawing>
-          <wp:inline distT="0" distB="0" distL="0" distR="0">
-            <wp:extent cx="476250" cy="476250"/>
-            <wp:effectExtent t="0" r="0" b="0" l="0"/>
-            <wp:docPr id="1" name="Alt text" descr="Alt text" title="Alt text"/>
-            <wp:cNvGraphicFramePr>
-              <a:graphicFrameLocks xmlns:a="http://schemas.openxmlformats.org/drawingml/2006/main" noChangeAspect="1"/>
-            </wp:cNvGraphicFramePr>
-            <a:graphic xmlns:a="http://schemas.openxmlformats.org/drawingml/2006/main">
-              <a:graphicData uri="http://schemas.openxmlformats.org/drawingml/2006/picture">
-                <pic:pic xmlns:pic="http://schemas.openxmlformats.org/drawingml/2006/picture">
-                  <pic:nvPicPr>
-                    <pic:cNvPr id="0" name="" descr=""/>
-                    <pic:cNvPicPr>
-                      <a:picLocks noChangeAspect="1" noChangeArrowheads="1"/>
-                    </pic:cNvPicPr>
-                  </pic:nvPicPr>
-                  <pic:blipFill>
-                    <a:blip r:embed="rId6" cstate="none"/>
-                    <a:srcRect/>
-                    <a:stretch>
-                      <a:fillRect/>
-                    </a:stretch>
-                  </pic:blipFill>
-                  <pic:spPr bwMode="auto">
-                    <a:xfrm>
-                      <a:off x="0" y="0"/>
-                      <a:ext cx="476250" cy="476250"/>
-                    </a:xfrm>
-                    <a:prstGeom prst="rect">
-                      <a:avLst/>
-                    </a:prstGeom>
-                  </pic:spPr>
-                </pic:pic>
-              </a:graphicData>
-            </a:graphic>
-          </wp:inline>
-        </w:drawing>
-      </w:r>
+      <w:p>
+        <w:pPr>
+          <w:jc w:val="center"/>
+        </w:pPr>
+        <w:r>
+          <w:drawing>
+            <wp:inline distT="0" distB="0" distL="0" distR="0">
+              <wp:extent cx="476250" cy="476250"/>
+              <wp:effectExtent t="0" r="0" b="0" l="0"/>
+              <wp:docPr id="1" name="Alt text" descr="Alt text" title="Alt text"/>
+              <wp:cNvGraphicFramePr>
+                <a:graphicFrameLocks xmlns:a="http://schemas.openxmlformats.org/drawingml/2006/main" noChangeAspect="1"/>
+              </wp:cNvGraphicFramePr>
+              <a:graphic xmlns:a="http://schemas.openxmlformats.org/drawingml/2006/main">
+                <a:graphicData uri="http://schemas.openxmlformats.org/drawingml/2006/picture">
+                  <pic:pic xmlns:pic="http://schemas.openxmlformats.org/drawingml/2006/picture">
+                    <pic:nvPicPr>
+                      <pic:cNvPr id="0" name="" descr=""/>
+                      <pic:cNvPicPr>
+                        <a:picLocks noChangeAspect="1" noChangeArrowheads="1"/>
+                      </pic:cNvPicPr>
+                    </pic:nvPicPr>
+                    <pic:blipFill>
+                      <a:blip r:embed="rId6" cstate="none"/>
+                      <a:srcRect/>
+                      <a:stretch>
+                        <a:fillRect/>
+                      </a:stretch>
+                    </pic:blipFill>
+                    <pic:spPr bwMode="auto">
+                      <a:xfrm>
+                        <a:off x="0" y="0"/>
+                        <a:ext cx="476250" cy="476250"/>
+                      </a:xfrm>
+                      <a:prstGeom prst="rect">
+                        <a:avLst/>
+                      </a:prstGeom>
+                    </pic:spPr>
+                  </pic:pic>
+                </a:graphicData>
+              </a:graphic>
+            </wp:inline>
+          </w:drawing>
+        </w:r>
+      </w:p>
     </w:p>
     <w:p>
       <w:pPr>
@@ -1701,53 +1731,58 @@
         <w:pStyle w:val="Heading2"/>
         <w:pStyle w:val="MdHeading2"/>
       </w:pPr>
-      <w:r>
-        <w:drawing>
-          <wp:inline distT="0" distB="0" distL="0" distR="0">
-            <wp:extent cx="198120" cy="240030"/>
-            <wp:effectExtent t="0" r="0" b="0" l="0"/>
-            <wp:docPr id="1" name="Alt text" descr="Alt text" title="Alt text"/>
-            <wp:cNvGraphicFramePr>
-              <a:graphicFrameLocks xmlns:a="http://schemas.openxmlformats.org/drawingml/2006/main" noChangeAspect="1"/>
-            </wp:cNvGraphicFramePr>
-            <a:graphic xmlns:a="http://schemas.openxmlformats.org/drawingml/2006/main">
-              <a:graphicData uri="http://schemas.openxmlformats.org/drawingml/2006/picture">
-                <pic:pic xmlns:pic="http://schemas.openxmlformats.org/drawingml/2006/picture">
-                  <pic:nvPicPr>
-                    <pic:cNvPr id="0" name="" descr=""/>
-                    <pic:cNvPicPr>
-                      <a:picLocks noChangeAspect="1" noChangeArrowheads="1"/>
-                    </pic:cNvPicPr>
-                  </pic:nvPicPr>
-                  <pic:blipFill>
-                    <a:blip r:embed="rId6" cstate="none"/>
-                    <a:srcRect/>
-                    <a:stretch>
-                      <a:fillRect/>
-                    </a:stretch>
-                  </pic:blipFill>
-                  <pic:spPr bwMode="auto">
-                    <a:xfrm>
-                      <a:off x="0" y="0"/>
-                      <a:ext cx="198120" cy="240030"/>
-                    </a:xfrm>
-                    <a:prstGeom prst="rect">
-                      <a:avLst/>
-                    </a:prstGeom>
-                  </pic:spPr>
-                </pic:pic>
-              </a:graphicData>
-            </a:graphic>
-          </wp:inline>
-        </w:drawing>
-      </w:r>
+      <w:p>
+        <w:pPr>
+          <w:jc w:val="center"/>
+        </w:pPr>
+        <w:r>
+          <w:drawing>
+            <wp:inline distT="0" distB="0" distL="0" distR="0">
+              <wp:extent cx="198120" cy="240030"/>
+              <wp:effectExtent t="0" r="0" b="0" l="0"/>
+              <wp:docPr id="1" name="Alt text" descr="Alt text" title="Alt text"/>
+              <wp:cNvGraphicFramePr>
+                <a:graphicFrameLocks xmlns:a="http://schemas.openxmlformats.org/drawingml/2006/main" noChangeAspect="1"/>
+              </wp:cNvGraphicFramePr>
+              <a:graphic xmlns:a="http://schemas.openxmlformats.org/drawingml/2006/main">
+                <a:graphicData uri="http://schemas.openxmlformats.org/drawingml/2006/picture">
+                  <pic:pic xmlns:pic="http://schemas.openxmlformats.org/drawingml/2006/picture">
+                    <pic:nvPicPr>
+                      <pic:cNvPr id="0" name="" descr=""/>
+                      <pic:cNvPicPr>
+                        <a:picLocks noChangeAspect="1" noChangeArrowheads="1"/>
+                      </pic:cNvPicPr>
+                    </pic:nvPicPr>
+                    <pic:blipFill>
+                      <a:blip r:embed="rId6" cstate="none"/>
+                      <a:srcRect/>
+                      <a:stretch>
+                        <a:fillRect/>
+                      </a:stretch>
+                    </pic:blipFill>
+                    <pic:spPr bwMode="auto">
+                      <a:xfrm>
+                        <a:off x="0" y="0"/>
+                        <a:ext cx="198120" cy="240030"/>
+                      </a:xfrm>
+                      <a:prstGeom prst="rect">
+                        <a:avLst/>
+                      </a:prstGeom>
+                    </pic:spPr>
+                  </pic:pic>
+                </a:graphicData>
+              </a:graphic>
+            </wp:inline>
+          </w:drawing>
+        </w:r>
+      </w:p>
     </w:p>
     <w:p>
       <w:pPr>
         <w:pStyle w:val="Heading1"/>
         <w:pStyle w:val="MdHeading1"/>
       </w:pPr>
-      <w:hyperlink w:history="1" r:id="rId1pvmmkyruh9rccdlbh7kh">
+      <w:hyperlink w:history="1" r:id="rId6rvh6wjk0hpwj9oxdmjmv">
         <w:r>
           <w:rPr>
             <w:rStyle w:val="MdLink"/>
@@ -2652,46 +2687,51 @@
             <w:pPr>
               <w:pStyle w:val="MdTableCell"/>
             </w:pPr>
-            <w:r>
-              <w:drawing>
-                <wp:inline distT="0" distB="0" distL="0" distR="0">
-                  <wp:extent cx="990600" cy="1200150"/>
-                  <wp:effectExtent t="0" r="0" b="0" l="0"/>
-                  <wp:docPr id="1" name="alt text" descr="alt text" title="Logo Title Text 1"/>
-                  <wp:cNvGraphicFramePr>
-                    <a:graphicFrameLocks xmlns:a="http://schemas.openxmlformats.org/drawingml/2006/main" noChangeAspect="1"/>
-                  </wp:cNvGraphicFramePr>
-                  <a:graphic xmlns:a="http://schemas.openxmlformats.org/drawingml/2006/main">
-                    <a:graphicData uri="http://schemas.openxmlformats.org/drawingml/2006/picture">
-                      <pic:pic xmlns:pic="http://schemas.openxmlformats.org/drawingml/2006/picture">
-                        <pic:nvPicPr>
-                          <pic:cNvPr id="0" name="" descr=""/>
-                          <pic:cNvPicPr>
-                            <a:picLocks noChangeAspect="1" noChangeArrowheads="1"/>
-                          </pic:cNvPicPr>
-                        </pic:nvPicPr>
-                        <pic:blipFill>
-                          <a:blip r:embed="rId6" cstate="none"/>
-                          <a:srcRect/>
-                          <a:stretch>
-                            <a:fillRect/>
-                          </a:stretch>
-                        </pic:blipFill>
-                        <pic:spPr bwMode="auto">
-                          <a:xfrm>
-                            <a:off x="0" y="0"/>
-                            <a:ext cx="990600" cy="1200150"/>
-                          </a:xfrm>
-                          <a:prstGeom prst="rect">
-                            <a:avLst/>
-                          </a:prstGeom>
-                        </pic:spPr>
-                      </pic:pic>
-                    </a:graphicData>
-                  </a:graphic>
-                </wp:inline>
-              </w:drawing>
-            </w:r>
+            <w:p>
+              <w:pPr>
+                <w:jc w:val="center"/>
+              </w:pPr>
+              <w:r>
+                <w:drawing>
+                  <wp:inline distT="0" distB="0" distL="0" distR="0">
+                    <wp:extent cx="990600" cy="1200150"/>
+                    <wp:effectExtent t="0" r="0" b="0" l="0"/>
+                    <wp:docPr id="1" name="alt text" descr="alt text" title="Logo Title Text 1"/>
+                    <wp:cNvGraphicFramePr>
+                      <a:graphicFrameLocks xmlns:a="http://schemas.openxmlformats.org/drawingml/2006/main" noChangeAspect="1"/>
+                    </wp:cNvGraphicFramePr>
+                    <a:graphic xmlns:a="http://schemas.openxmlformats.org/drawingml/2006/main">
+                      <a:graphicData uri="http://schemas.openxmlformats.org/drawingml/2006/picture">
+                        <pic:pic xmlns:pic="http://schemas.openxmlformats.org/drawingml/2006/picture">
+                          <pic:nvPicPr>
+                            <pic:cNvPr id="0" name="" descr=""/>
+                            <pic:cNvPicPr>
+                              <a:picLocks noChangeAspect="1" noChangeArrowheads="1"/>
+                            </pic:cNvPicPr>
+                          </pic:nvPicPr>
+                          <pic:blipFill>
+                            <a:blip r:embed="rId6" cstate="none"/>
+                            <a:srcRect/>
+                            <a:stretch>
+                              <a:fillRect/>
+                            </a:stretch>
+                          </pic:blipFill>
+                          <pic:spPr bwMode="auto">
+                            <a:xfrm>
+                              <a:off x="0" y="0"/>
+                              <a:ext cx="990600" cy="1200150"/>
+                            </a:xfrm>
+                            <a:prstGeom prst="rect">
+                              <a:avLst/>
+                            </a:prstGeom>
+                          </pic:spPr>
+                        </pic:pic>
+                      </a:graphicData>
+                    </a:graphic>
+                  </wp:inline>
+                </w:drawing>
+              </w:r>
+            </w:p>
           </w:p>
         </w:tc>
         <w:tc>
@@ -3893,6 +3933,7 @@
   <w:docDefaults>
     <w:rPrDefault>
       <w:rPr>
+        <w:rFonts w:ascii="Times New Roman" w:cs="Times New Roman" w:eastAsia="Times New Roman" w:hAnsi="Times New Roman"/>
         <w:sz w:val="24"/>
         <w:szCs w:val="24"/>
       </w:rPr>
@@ -3924,11 +3965,12 @@
       <w:outlineLvl w:val="0"/>
     </w:pPr>
     <w:rPr>
+      <w:rFonts w:ascii="Arial" w:cs="Arial" w:eastAsia="Arial" w:hAnsi="Arial"/>
       <w:b/>
       <w:bCs/>
-      <w:color w:val="2F5597"/>
-      <w:sz w:val="36"/>
-      <w:szCs w:val="36"/>
+      <w:color w:val="5B21B6"/>
+      <w:sz w:val="132"/>
+      <w:szCs w:val="132"/>
     </w:rPr>
   </w:style>
   <w:style w:type="paragraph" w:styleId="Heading2">
@@ -3942,11 +3984,12 @@
       <w:outlineLvl w:val="1"/>
     </w:pPr>
     <w:rPr>
+      <w:rFonts w:ascii="Arial" w:cs="Arial" w:eastAsia="Arial" w:hAnsi="Arial"/>
       <w:b/>
       <w:bCs/>
-      <w:color w:val="5B9BD5"/>
-      <w:sz w:val="32"/>
-      <w:szCs w:val="32"/>
+      <w:color w:val="7C3AED"/>
+      <w:sz w:val="104"/>
+      <w:szCs w:val="104"/>
     </w:rPr>
   </w:style>
   <w:style w:type="paragraph" w:styleId="Heading3">
@@ -3960,11 +4003,12 @@
       <w:outlineLvl w:val="2"/>
     </w:pPr>
     <w:rPr>
+      <w:rFonts w:ascii="Arial" w:cs="Arial" w:eastAsia="Arial" w:hAnsi="Arial"/>
       <w:b/>
       <w:bCs/>
-      <w:color w:val="44546A"/>
-      <w:sz w:val="28"/>
-      <w:szCs w:val="28"/>
+      <w:color w:val="8B5CF6"/>
+      <w:sz w:val="84"/>
+      <w:szCs w:val="84"/>
     </w:rPr>
   </w:style>
   <w:style w:type="paragraph" w:styleId="Heading4">
@@ -3978,9 +4022,10 @@
       <w:outlineLvl w:val="3"/>
     </w:pPr>
     <w:rPr>
+      <w:rFonts w:ascii="Arial" w:cs="Arial" w:eastAsia="Arial" w:hAnsi="Arial"/>
       <w:b/>
       <w:bCs/>
-      <w:color w:val="44546A"/>
+      <w:color w:val="374151"/>
       <w:sz w:val="26"/>
       <w:szCs w:val="26"/>
     </w:rPr>
@@ -3996,11 +4041,12 @@
       <w:outlineLvl w:val="4"/>
     </w:pPr>
     <w:rPr>
+      <w:rFonts w:ascii="Arial" w:cs="Arial" w:eastAsia="Arial" w:hAnsi="Arial"/>
       <w:b/>
       <w:bCs/>
       <w:i/>
       <w:iCs/>
-      <w:color w:val="44546A"/>
+      <w:color w:val="374151"/>
       <w:sz w:val="24"/>
       <w:szCs w:val="24"/>
     </w:rPr>
@@ -4016,11 +4062,12 @@
       <w:outlineLvl w:val="5"/>
     </w:pPr>
     <w:rPr>
+      <w:rFonts w:ascii="Arial" w:cs="Arial" w:eastAsia="Arial" w:hAnsi="Arial"/>
       <w:b w:val="false"/>
       <w:bCs w:val="false"/>
       <w:i/>
       <w:iCs/>
-      <w:color w:val="44546A"/>
+      <w:color w:val="374151"/>
       <w:sz w:val="24"/>
       <w:szCs w:val="24"/>
     </w:rPr>
@@ -4096,8 +4143,8 @@
       <w:spacing w:before="0" w:after="0"/>
     </w:pPr>
     <w:rPr>
-      <w:sz w:val="12"/>
-      <w:szCs w:val="12"/>
+      <w:sz w:val="36"/>
+      <w:szCs w:val="36"/>
     </w:rPr>
   </w:style>
   <w:style w:type="paragraph" w:styleId="MdCode">
@@ -4116,10 +4163,10 @@
       <w:spacing w:before="200" w:after="200"/>
     </w:pPr>
     <w:rPr>
-      <w:rFonts w:ascii="Courier New" w:cs="Courier New" w:eastAsia="Courier New" w:hAnsi="Courier New"/>
-      <w:color w:val="032F62"/>
-      <w:sz w:val="22"/>
-      <w:szCs w:val="22"/>
+      <w:rFonts w:ascii="Fira Code" w:cs="Fira Code" w:eastAsia="Fira Code" w:hAnsi="Fira Code"/>
+      <w:color w:val="EC4899"/>
+      <w:sz w:val="40"/>
+      <w:szCs w:val="40"/>
     </w:rPr>
   </w:style>
   <w:style w:type="paragraph" w:styleId="MdHr">
@@ -4141,16 +4188,17 @@
     <w:qFormat/>
     <w:pPr>
       <w:pBdr>
-        <w:left w:val="single" w:color="666666" w:sz="20" w:space="12"/>
+        <w:left w:val="single" w:color="6B7280" w:sz="20" w:space="12"/>
       </w:pBdr>
       <w:shd w:fill="F9F9F9"/>
       <w:spacing w:before="200" w:after="200"/>
       <w:ind w:left="360"/>
     </w:pPr>
     <w:rPr>
+      <w:rFonts w:ascii="Georgia" w:cs="Georgia" w:eastAsia="Georgia" w:hAnsi="Georgia"/>
       <w:i/>
       <w:iCs/>
-      <w:color w:val="666666"/>
+      <w:color w:val="6B7280"/>
     </w:rPr>
   </w:style>
   <w:style w:type="paragraph" w:styleId="MdHtml">
@@ -4159,7 +4207,7 @@
     <w:next w:val="Normal"/>
     <w:qFormat/>
     <w:rPr>
-      <w:rFonts w:ascii="Courier New" w:cs="Courier New" w:eastAsia="Courier New" w:hAnsi="Courier New"/>
+      <w:rFonts w:ascii="Fira Code" w:cs="Fira Code" w:eastAsia="Fira Code" w:hAnsi="Fira Code"/>
       <w:color w:val="4472C4"/>
     </w:rPr>
   </w:style>
@@ -4242,11 +4290,12 @@
       <w:outlineLvl w:val="0"/>
     </w:pPr>
     <w:rPr>
+      <w:rFonts w:ascii="Arial" w:cs="Arial" w:eastAsia="Arial" w:hAnsi="Arial"/>
       <w:b/>
       <w:bCs/>
-      <w:color w:val="2F5597"/>
-      <w:sz w:val="36"/>
-      <w:szCs w:val="36"/>
+      <w:color w:val="5B21B6"/>
+      <w:sz w:val="132"/>
+      <w:szCs w:val="132"/>
     </w:rPr>
   </w:style>
   <w:style w:type="paragraph" w:styleId="MdHeading2">
@@ -4260,11 +4309,12 @@
       <w:outlineLvl w:val="1"/>
     </w:pPr>
     <w:rPr>
+      <w:rFonts w:ascii="Arial" w:cs="Arial" w:eastAsia="Arial" w:hAnsi="Arial"/>
       <w:b/>
       <w:bCs/>
-      <w:color w:val="5B9BD5"/>
-      <w:sz w:val="32"/>
-      <w:szCs w:val="32"/>
+      <w:color w:val="7C3AED"/>
+      <w:sz w:val="104"/>
+      <w:szCs w:val="104"/>
     </w:rPr>
   </w:style>
   <w:style w:type="paragraph" w:styleId="MdHeading3">
@@ -4278,11 +4328,12 @@
       <w:outlineLvl w:val="2"/>
     </w:pPr>
     <w:rPr>
+      <w:rFonts w:ascii="Arial" w:cs="Arial" w:eastAsia="Arial" w:hAnsi="Arial"/>
       <w:b/>
       <w:bCs/>
-      <w:color w:val="44546A"/>
-      <w:sz w:val="28"/>
-      <w:szCs w:val="28"/>
+      <w:color w:val="8B5CF6"/>
+      <w:sz w:val="84"/>
+      <w:szCs w:val="84"/>
     </w:rPr>
   </w:style>
   <w:style w:type="paragraph" w:styleId="MdHeading4">
@@ -4296,9 +4347,10 @@
       <w:outlineLvl w:val="3"/>
     </w:pPr>
     <w:rPr>
+      <w:rFonts w:ascii="Arial" w:cs="Arial" w:eastAsia="Arial" w:hAnsi="Arial"/>
       <w:b/>
       <w:bCs/>
-      <w:color w:val="44546A"/>
+      <w:color w:val="374151"/>
       <w:sz w:val="26"/>
       <w:szCs w:val="26"/>
     </w:rPr>
@@ -4314,11 +4366,12 @@
       <w:outlineLvl w:val="4"/>
     </w:pPr>
     <w:rPr>
+      <w:rFonts w:ascii="Arial" w:cs="Arial" w:eastAsia="Arial" w:hAnsi="Arial"/>
       <w:b/>
       <w:bCs/>
       <w:i/>
       <w:iCs/>
-      <w:color w:val="44546A"/>
+      <w:color w:val="374151"/>
       <w:sz w:val="24"/>
       <w:szCs w:val="24"/>
     </w:rPr>
@@ -4334,11 +4387,12 @@
       <w:outlineLvl w:val="5"/>
     </w:pPr>
     <w:rPr>
+      <w:rFonts w:ascii="Arial" w:cs="Arial" w:eastAsia="Arial" w:hAnsi="Arial"/>
       <w:b w:val="false"/>
       <w:bCs w:val="false"/>
       <w:i/>
       <w:iCs/>
-      <w:color w:val="44546A"/>
+      <w:color w:val="374151"/>
       <w:sz w:val="24"/>
       <w:szCs w:val="24"/>
     </w:rPr>
@@ -4351,7 +4405,7 @@
     <w:unhideWhenUsed/>
     <w:qFormat/>
     <w:rPr>
-      <w:rFonts w:ascii="Courier New" w:cs="Courier New" w:eastAsia="Courier New" w:hAnsi="Courier New"/>
+      <w:rFonts w:ascii="Fira Code" w:cs="Fira Code" w:eastAsia="Fira Code" w:hAnsi="Fira Code"/>
       <w:color w:val="ED7D31"/>
     </w:rPr>
   </w:style>
@@ -4363,8 +4417,7 @@
     <w:unhideWhenUsed/>
     <w:qFormat/>
     <w:rPr>
-      <w:color w:val="0563C1"/>
-      <w:u w:val="single"/>
+      <w:color w:val="00fb0a"/>
     </w:rPr>
   </w:style>
   <w:style w:type="character" w:styleId="MdStrong">
@@ -4399,7 +4452,7 @@
     <w:unhideWhenUsed/>
     <w:qFormat/>
     <w:rPr>
-      <w:rFonts w:ascii="Courier New" w:cs="Courier New" w:eastAsia="Courier New" w:hAnsi="Courier New"/>
+      <w:rFonts w:ascii="Fira Code" w:cs="Fira Code" w:eastAsia="Fira Code" w:hAnsi="Fira Code"/>
       <w:color w:val="70AD47"/>
     </w:rPr>
   </w:style>
@@ -4412,7 +4465,7 @@
     <w:qFormat/>
     <w:rPr>
       <w:strike/>
-      <w:color w:val="FF0000"/>
+      <w:color w:val="EF4444"/>
     </w:rPr>
   </w:style>
   <w:style w:type="character" w:styleId="MdBr">

</xml_diff>

<commit_message>
feat: add imageDefaultSize theme
</commit_message>
<xml_diff>
--- a/tests/markdown.docx
+++ b/tests/markdown.docx
@@ -927,7 +927,7 @@
       <w:r>
         <w:t xml:space="preserve">@mentions, #refs, </w:t>
       </w:r>
-      <w:hyperlink w:history="1" r:id="rIdlvknff6cygb5dkaeze74c">
+      <w:hyperlink w:history="1" r:id="rIdyte7plqgkoxjrbukqllfe">
         <w:r>
           <w:rPr>
             <w:rStyle w:val="MdLink"/>
@@ -1152,7 +1152,7 @@
       <w:pPr>
         <w:pStyle w:val="MdParagraph"/>
       </w:pPr>
-      <w:hyperlink w:history="1" r:id="rIdqdwswjue9vnoibkund59l">
+      <w:hyperlink w:history="1" r:id="rIdazof2o1p6zkoajukrqwpc">
         <w:r>
           <w:rPr>
             <w:rStyle w:val="MdLink"/>
@@ -1170,7 +1170,7 @@
       <w:pPr>
         <w:pStyle w:val="MdParagraph"/>
       </w:pPr>
-      <w:hyperlink w:history="1" r:id="rIdurjflq55pngennbsjnw2x">
+      <w:hyperlink w:history="1" r:id="rIdmvun_4opefsfwbiujiybx">
         <w:r>
           <w:rPr>
             <w:rStyle w:val="MdLink"/>
@@ -1188,7 +1188,7 @@
       <w:pPr>
         <w:pStyle w:val="MdParagraph"/>
       </w:pPr>
-      <w:hyperlink w:history="1" r:id="rIdmd-htyfhyww5zorenfolg">
+      <w:hyperlink w:history="1" r:id="rIdrmjyt3xjdho07o2d65ymt">
         <w:r>
           <w:rPr>
             <w:rStyle w:val="MdLink"/>
@@ -1206,7 +1206,7 @@
       <w:pPr>
         <w:pStyle w:val="MdParagraph"/>
       </w:pPr>
-      <w:hyperlink w:history="1" r:id="rId7guef8mbyd5a6p1fuyzkj">
+      <w:hyperlink w:history="1" r:id="rIdu6_lsbordgumgg39wo0jq">
         <w:r>
           <w:rPr>
             <w:rStyle w:val="MdLink"/>
@@ -1224,7 +1224,7 @@
       <w:pPr>
         <w:pStyle w:val="MdParagraph"/>
       </w:pPr>
-      <w:hyperlink w:history="1" r:id="rId6spej09yqiloxm-nst9gs">
+      <w:hyperlink w:history="1" r:id="rIdsusindndpycshpb9zymo_">
         <w:r>
           <w:rPr>
             <w:rStyle w:val="MdLink"/>
@@ -1245,7 +1245,7 @@
       <w:r>
         <w:t xml:space="preserve">Or leave it empty and use the </w:t>
       </w:r>
-      <w:hyperlink w:history="1" r:id="rIdzzmumb5y_uyovbtlh3hgq">
+      <w:hyperlink w:history="1" r:id="rId56fxwmkd0yqy4l-pilp60">
         <w:r>
           <w:rPr>
             <w:rStyle w:val="MdLink"/>
@@ -1270,7 +1270,7 @@
         <w:t xml:space="preserve">URLs and URLs in angle brackets will automatically get turned into links.
 </w:t>
       </w:r>
-      <w:hyperlink w:history="1" r:id="rIdxzspj5axmubo8autzuklw">
+      <w:hyperlink w:history="1" r:id="rIdwdrsy4n_ighx14x2mzpeo">
         <w:r>
           <w:rPr>
             <w:rStyle w:val="MdLink"/>
@@ -1281,7 +1281,7 @@
       <w:r>
         <w:t xml:space="preserve"> or </w:t>
       </w:r>
-      <w:hyperlink w:history="1" r:id="rIdonuf86zq-szsoxxis77tm">
+      <w:hyperlink w:history="1" r:id="rIdlhe0y7axf6mh3ljhill9l">
         <w:r>
           <w:rPr>
             <w:rStyle w:val="MdLink"/>
@@ -1365,7 +1365,7 @@
         <w:r>
           <w:drawing>
             <wp:inline distT="0" distB="0" distL="0" distR="0">
-              <wp:extent cx="990600" cy="1200150"/>
+              <wp:extent cx="5734050" cy="6943725"/>
               <wp:effectExtent t="0" r="0" b="0" l="0"/>
               <wp:docPr id="1" name="alt text" descr="alt text" title="Logo Title Text 1"/>
               <wp:cNvGraphicFramePr>
@@ -1390,7 +1390,7 @@
                     <pic:spPr bwMode="auto">
                       <a:xfrm>
                         <a:off x="0" y="0"/>
-                        <a:ext cx="990600" cy="1200150"/>
+                        <a:ext cx="5734050" cy="6943725"/>
                       </a:xfrm>
                       <a:prstGeom prst="rect">
                         <a:avLst/>
@@ -1424,7 +1424,7 @@
         <w:r>
           <w:drawing>
             <wp:inline distT="0" distB="0" distL="0" distR="0">
-              <wp:extent cx="990600" cy="1200150"/>
+              <wp:extent cx="5734050" cy="6943725"/>
               <wp:effectExtent t="0" r="0" b="0" l="0"/>
               <wp:docPr id="1" name="alt text" descr="alt text" title="Logo Title Text 2"/>
               <wp:cNvGraphicFramePr>
@@ -1449,7 +1449,7 @@
                     <pic:spPr bwMode="auto">
                       <a:xfrm>
                         <a:off x="0" y="0"/>
-                        <a:ext cx="990600" cy="1200150"/>
+                        <a:ext cx="5734050" cy="6943725"/>
                       </a:xfrm>
                       <a:prstGeom prst="rect">
                         <a:avLst/>
@@ -1479,7 +1479,7 @@
         <w:r>
           <w:drawing>
             <wp:inline distT="0" distB="0" distL="0" distR="0">
-              <wp:extent cx="4152900" cy="1181100"/>
+              <wp:extent cx="5734050" cy="1628775"/>
               <wp:effectExtent t="0" r="0" b="0" l="0"/>
               <wp:docPr id="1" name="Minion" descr="Minion" title="Minion"/>
               <wp:cNvGraphicFramePr>
@@ -1504,7 +1504,7 @@
                     <pic:spPr bwMode="auto">
                       <a:xfrm>
                         <a:off x="0" y="0"/>
-                        <a:ext cx="4152900" cy="1181100"/>
+                        <a:ext cx="5734050" cy="1628775"/>
                       </a:xfrm>
                       <a:prstGeom prst="rect">
                         <a:avLst/>
@@ -1528,7 +1528,7 @@
         <w:r>
           <w:drawing>
             <wp:inline distT="0" distB="0" distL="0" distR="0">
-              <wp:extent cx="1066800" cy="1066800"/>
+              <wp:extent cx="5734050" cy="5734050"/>
               <wp:effectExtent t="0" r="0" b="0" l="0"/>
               <wp:docPr id="1" name="Stormtroopocat" descr="Stormtroopocat" title="The Stormtroopocat"/>
               <wp:cNvGraphicFramePr>
@@ -1553,7 +1553,7 @@
                     <pic:spPr bwMode="auto">
                       <a:xfrm>
                         <a:off x="0" y="0"/>
-                        <a:ext cx="1066800" cy="1066800"/>
+                        <a:ext cx="5734050" cy="5734050"/>
                       </a:xfrm>
                       <a:prstGeom prst="rect">
                         <a:avLst/>
@@ -1596,7 +1596,7 @@
         <w:r>
           <w:drawing>
             <wp:inline distT="0" distB="0" distL="0" distR="0">
-              <wp:extent cx="1066800" cy="1066800"/>
+              <wp:extent cx="5734050" cy="5734050"/>
               <wp:effectExtent t="0" r="0" b="0" l="0"/>
               <wp:docPr id="1" name="Alt text" descr="Alt text" title="The Dojocat"/>
               <wp:cNvGraphicFramePr>
@@ -1621,7 +1621,7 @@
                     <pic:spPr bwMode="auto">
                       <a:xfrm>
                         <a:off x="0" y="0"/>
-                        <a:ext cx="1066800" cy="1066800"/>
+                        <a:ext cx="5734050" cy="5734050"/>
                       </a:xfrm>
                       <a:prstGeom prst="rect">
                         <a:avLst/>
@@ -1782,7 +1782,7 @@
         <w:pStyle w:val="Heading1"/>
         <w:pStyle w:val="MdHeading1"/>
       </w:pPr>
-      <w:hyperlink w:history="1" r:id="rId6rvh6wjk0hpwj9oxdmjmv">
+      <w:hyperlink w:history="1" r:id="rIdbmd9qtzd4i4cpg2ak8vjv">
         <w:r>
           <w:rPr>
             <w:rStyle w:val="MdLink"/>
@@ -2694,7 +2694,7 @@
               <w:r>
                 <w:drawing>
                   <wp:inline distT="0" distB="0" distL="0" distR="0">
-                    <wp:extent cx="990600" cy="1200150"/>
+                    <wp:extent cx="5734050" cy="6943725"/>
                     <wp:effectExtent t="0" r="0" b="0" l="0"/>
                     <wp:docPr id="1" name="alt text" descr="alt text" title="Logo Title Text 1"/>
                     <wp:cNvGraphicFramePr>
@@ -2719,7 +2719,7 @@
                           <pic:spPr bwMode="auto">
                             <a:xfrm>
                               <a:off x="0" y="0"/>
-                              <a:ext cx="990600" cy="1200150"/>
+                              <a:ext cx="5734050" cy="6943725"/>
                             </a:xfrm>
                             <a:prstGeom prst="rect">
                               <a:avLst/>

</xml_diff>

<commit_message>
fix: handle image alignment at the paragraph level
</commit_message>
<xml_diff>
--- a/tests/markdown.docx
+++ b/tests/markdown.docx
@@ -927,7 +927,7 @@
       <w:r>
         <w:t xml:space="preserve">@mentions, #refs, </w:t>
       </w:r>
-      <w:hyperlink w:history="1" r:id="rIdyte7plqgkoxjrbukqllfe">
+      <w:hyperlink w:history="1" r:id="rIdvqgajkq3ji3fxv5_eqm-w">
         <w:r>
           <w:rPr>
             <w:rStyle w:val="MdLink"/>
@@ -1152,7 +1152,7 @@
       <w:pPr>
         <w:pStyle w:val="MdParagraph"/>
       </w:pPr>
-      <w:hyperlink w:history="1" r:id="rIdazof2o1p6zkoajukrqwpc">
+      <w:hyperlink w:history="1" r:id="rIdxppvuqvg1j5dnpo7mhift">
         <w:r>
           <w:rPr>
             <w:rStyle w:val="MdLink"/>
@@ -1170,7 +1170,7 @@
       <w:pPr>
         <w:pStyle w:val="MdParagraph"/>
       </w:pPr>
-      <w:hyperlink w:history="1" r:id="rIdmvun_4opefsfwbiujiybx">
+      <w:hyperlink w:history="1" r:id="rIdlkorp3pwo41bj_xrmhmrw">
         <w:r>
           <w:rPr>
             <w:rStyle w:val="MdLink"/>
@@ -1188,7 +1188,7 @@
       <w:pPr>
         <w:pStyle w:val="MdParagraph"/>
       </w:pPr>
-      <w:hyperlink w:history="1" r:id="rIdrmjyt3xjdho07o2d65ymt">
+      <w:hyperlink w:history="1" r:id="rIdidmhvansoupm7zbphjkjh">
         <w:r>
           <w:rPr>
             <w:rStyle w:val="MdLink"/>
@@ -1206,7 +1206,7 @@
       <w:pPr>
         <w:pStyle w:val="MdParagraph"/>
       </w:pPr>
-      <w:hyperlink w:history="1" r:id="rIdu6_lsbordgumgg39wo0jq">
+      <w:hyperlink w:history="1" r:id="rIdebj8p5h5xn9ufsoeps2db">
         <w:r>
           <w:rPr>
             <w:rStyle w:val="MdLink"/>
@@ -1224,7 +1224,7 @@
       <w:pPr>
         <w:pStyle w:val="MdParagraph"/>
       </w:pPr>
-      <w:hyperlink w:history="1" r:id="rIdsusindndpycshpb9zymo_">
+      <w:hyperlink w:history="1" r:id="rIdkjxqktsbabyexy-gigxda">
         <w:r>
           <w:rPr>
             <w:rStyle w:val="MdLink"/>
@@ -1245,7 +1245,7 @@
       <w:r>
         <w:t xml:space="preserve">Or leave it empty and use the </w:t>
       </w:r>
-      <w:hyperlink w:history="1" r:id="rId56fxwmkd0yqy4l-pilp60">
+      <w:hyperlink w:history="1" r:id="rId5xtyja4jycgswrsgyk7y8">
         <w:r>
           <w:rPr>
             <w:rStyle w:val="MdLink"/>
@@ -1270,7 +1270,7 @@
         <w:t xml:space="preserve">URLs and URLs in angle brackets will automatically get turned into links.
 </w:t>
       </w:r>
-      <w:hyperlink w:history="1" r:id="rIdwdrsy4n_ighx14x2mzpeo">
+      <w:hyperlink w:history="1" r:id="rIdmz9hrikcg-9s_4uah6dgf">
         <w:r>
           <w:rPr>
             <w:rStyle w:val="MdLink"/>
@@ -1281,7 +1281,7 @@
       <w:r>
         <w:t xml:space="preserve"> or </w:t>
       </w:r>
-      <w:hyperlink w:history="1" r:id="rIdlhe0y7axf6mh3ljhill9l">
+      <w:hyperlink w:history="1" r:id="rIdkv5rgeuznbnoot3yw4lji">
         <w:r>
           <w:rPr>
             <w:rStyle w:val="MdLink"/>
@@ -1358,51 +1358,46 @@
         <w:t xml:space="preserve">Inline-style:
 </w:t>
       </w:r>
-      <w:p>
-        <w:pPr>
-          <w:jc w:val="center"/>
-        </w:pPr>
-        <w:r>
-          <w:drawing>
-            <wp:inline distT="0" distB="0" distL="0" distR="0">
-              <wp:extent cx="5734050" cy="6943725"/>
-              <wp:effectExtent t="0" r="0" b="0" l="0"/>
-              <wp:docPr id="1" name="alt text" descr="alt text" title="Logo Title Text 1"/>
-              <wp:cNvGraphicFramePr>
-                <a:graphicFrameLocks xmlns:a="http://schemas.openxmlformats.org/drawingml/2006/main" noChangeAspect="1"/>
-              </wp:cNvGraphicFramePr>
-              <a:graphic xmlns:a="http://schemas.openxmlformats.org/drawingml/2006/main">
-                <a:graphicData uri="http://schemas.openxmlformats.org/drawingml/2006/picture">
-                  <pic:pic xmlns:pic="http://schemas.openxmlformats.org/drawingml/2006/picture">
-                    <pic:nvPicPr>
-                      <pic:cNvPr id="0" name="" descr=""/>
-                      <pic:cNvPicPr>
-                        <a:picLocks noChangeAspect="1" noChangeArrowheads="1"/>
-                      </pic:cNvPicPr>
-                    </pic:nvPicPr>
-                    <pic:blipFill>
-                      <a:blip r:embed="rId6" cstate="none"/>
-                      <a:srcRect/>
-                      <a:stretch>
-                        <a:fillRect/>
-                      </a:stretch>
-                    </pic:blipFill>
-                    <pic:spPr bwMode="auto">
-                      <a:xfrm>
-                        <a:off x="0" y="0"/>
-                        <a:ext cx="5734050" cy="6943725"/>
-                      </a:xfrm>
-                      <a:prstGeom prst="rect">
-                        <a:avLst/>
-                      </a:prstGeom>
-                    </pic:spPr>
-                  </pic:pic>
-                </a:graphicData>
-              </a:graphic>
-            </wp:inline>
-          </w:drawing>
-        </w:r>
-      </w:p>
+      <w:r>
+        <w:drawing>
+          <wp:inline distT="0" distB="0" distL="0" distR="0">
+            <wp:extent cx="990600" cy="1200150"/>
+            <wp:effectExtent t="0" r="0" b="0" l="0"/>
+            <wp:docPr id="1" name="alt text" descr="alt text" title="Logo Title Text 1"/>
+            <wp:cNvGraphicFramePr>
+              <a:graphicFrameLocks xmlns:a="http://schemas.openxmlformats.org/drawingml/2006/main" noChangeAspect="1"/>
+            </wp:cNvGraphicFramePr>
+            <a:graphic xmlns:a="http://schemas.openxmlformats.org/drawingml/2006/main">
+              <a:graphicData uri="http://schemas.openxmlformats.org/drawingml/2006/picture">
+                <pic:pic xmlns:pic="http://schemas.openxmlformats.org/drawingml/2006/picture">
+                  <pic:nvPicPr>
+                    <pic:cNvPr id="0" name="" descr=""/>
+                    <pic:cNvPicPr>
+                      <a:picLocks noChangeAspect="1" noChangeArrowheads="1"/>
+                    </pic:cNvPicPr>
+                  </pic:nvPicPr>
+                  <pic:blipFill>
+                    <a:blip r:embed="rId6" cstate="none"/>
+                    <a:srcRect/>
+                    <a:stretch>
+                      <a:fillRect/>
+                    </a:stretch>
+                  </pic:blipFill>
+                  <pic:spPr bwMode="auto">
+                    <a:xfrm>
+                      <a:off x="0" y="0"/>
+                      <a:ext cx="990600" cy="1200150"/>
+                    </a:xfrm>
+                    <a:prstGeom prst="rect">
+                      <a:avLst/>
+                    </a:prstGeom>
+                  </pic:spPr>
+                </pic:pic>
+              </a:graphicData>
+            </a:graphic>
+          </wp:inline>
+        </w:drawing>
+      </w:r>
     </w:p>
     <w:p>
       <w:pPr>
@@ -1417,51 +1412,46 @@
         <w:t xml:space="preserve">Reference-style:
 </w:t>
       </w:r>
-      <w:p>
-        <w:pPr>
-          <w:jc w:val="center"/>
-        </w:pPr>
-        <w:r>
-          <w:drawing>
-            <wp:inline distT="0" distB="0" distL="0" distR="0">
-              <wp:extent cx="5734050" cy="6943725"/>
-              <wp:effectExtent t="0" r="0" b="0" l="0"/>
-              <wp:docPr id="1" name="alt text" descr="alt text" title="Logo Title Text 2"/>
-              <wp:cNvGraphicFramePr>
-                <a:graphicFrameLocks xmlns:a="http://schemas.openxmlformats.org/drawingml/2006/main" noChangeAspect="1"/>
-              </wp:cNvGraphicFramePr>
-              <a:graphic xmlns:a="http://schemas.openxmlformats.org/drawingml/2006/main">
-                <a:graphicData uri="http://schemas.openxmlformats.org/drawingml/2006/picture">
-                  <pic:pic xmlns:pic="http://schemas.openxmlformats.org/drawingml/2006/picture">
-                    <pic:nvPicPr>
-                      <pic:cNvPr id="0" name="" descr=""/>
-                      <pic:cNvPicPr>
-                        <a:picLocks noChangeAspect="1" noChangeArrowheads="1"/>
-                      </pic:cNvPicPr>
-                    </pic:nvPicPr>
-                    <pic:blipFill>
-                      <a:blip r:embed="rId6" cstate="none"/>
-                      <a:srcRect/>
-                      <a:stretch>
-                        <a:fillRect/>
-                      </a:stretch>
-                    </pic:blipFill>
-                    <pic:spPr bwMode="auto">
-                      <a:xfrm>
-                        <a:off x="0" y="0"/>
-                        <a:ext cx="5734050" cy="6943725"/>
-                      </a:xfrm>
-                      <a:prstGeom prst="rect">
-                        <a:avLst/>
-                      </a:prstGeom>
-                    </pic:spPr>
-                  </pic:pic>
-                </a:graphicData>
-              </a:graphic>
-            </wp:inline>
-          </w:drawing>
-        </w:r>
-      </w:p>
+      <w:r>
+        <w:drawing>
+          <wp:inline distT="0" distB="0" distL="0" distR="0">
+            <wp:extent cx="990600" cy="1200150"/>
+            <wp:effectExtent t="0" r="0" b="0" l="0"/>
+            <wp:docPr id="1" name="alt text" descr="alt text" title="Logo Title Text 2"/>
+            <wp:cNvGraphicFramePr>
+              <a:graphicFrameLocks xmlns:a="http://schemas.openxmlformats.org/drawingml/2006/main" noChangeAspect="1"/>
+            </wp:cNvGraphicFramePr>
+            <a:graphic xmlns:a="http://schemas.openxmlformats.org/drawingml/2006/main">
+              <a:graphicData uri="http://schemas.openxmlformats.org/drawingml/2006/picture">
+                <pic:pic xmlns:pic="http://schemas.openxmlformats.org/drawingml/2006/picture">
+                  <pic:nvPicPr>
+                    <pic:cNvPr id="0" name="" descr=""/>
+                    <pic:cNvPicPr>
+                      <a:picLocks noChangeAspect="1" noChangeArrowheads="1"/>
+                    </pic:cNvPicPr>
+                  </pic:nvPicPr>
+                  <pic:blipFill>
+                    <a:blip r:embed="rId6" cstate="none"/>
+                    <a:srcRect/>
+                    <a:stretch>
+                      <a:fillRect/>
+                    </a:stretch>
+                  </pic:blipFill>
+                  <pic:spPr bwMode="auto">
+                    <a:xfrm>
+                      <a:off x="0" y="0"/>
+                      <a:ext cx="990600" cy="1200150"/>
+                    </a:xfrm>
+                    <a:prstGeom prst="rect">
+                      <a:avLst/>
+                    </a:prstGeom>
+                  </pic:spPr>
+                </pic:pic>
+              </a:graphicData>
+            </a:graphic>
+          </wp:inline>
+        </w:drawing>
+      </w:r>
     </w:p>
     <w:p>
       <w:pPr>
@@ -1472,100 +1462,90 @@
       <w:pPr>
         <w:pStyle w:val="MdParagraph"/>
       </w:pPr>
-      <w:p>
-        <w:pPr>
-          <w:jc w:val="center"/>
-        </w:pPr>
-        <w:r>
-          <w:drawing>
-            <wp:inline distT="0" distB="0" distL="0" distR="0">
-              <wp:extent cx="5734050" cy="1628775"/>
-              <wp:effectExtent t="0" r="0" b="0" l="0"/>
-              <wp:docPr id="1" name="Minion" descr="Minion" title="Minion"/>
-              <wp:cNvGraphicFramePr>
-                <a:graphicFrameLocks xmlns:a="http://schemas.openxmlformats.org/drawingml/2006/main" noChangeAspect="1"/>
-              </wp:cNvGraphicFramePr>
-              <a:graphic xmlns:a="http://schemas.openxmlformats.org/drawingml/2006/main">
-                <a:graphicData uri="http://schemas.openxmlformats.org/drawingml/2006/picture">
-                  <pic:pic xmlns:pic="http://schemas.openxmlformats.org/drawingml/2006/picture">
-                    <pic:nvPicPr>
-                      <pic:cNvPr id="0" name="" descr=""/>
-                      <pic:cNvPicPr>
-                        <a:picLocks noChangeAspect="1" noChangeArrowheads="1"/>
-                      </pic:cNvPicPr>
-                    </pic:nvPicPr>
-                    <pic:blipFill>
-                      <a:blip r:embed="rId7" cstate="none"/>
-                      <a:srcRect/>
-                      <a:stretch>
-                        <a:fillRect/>
-                      </a:stretch>
-                    </pic:blipFill>
-                    <pic:spPr bwMode="auto">
-                      <a:xfrm>
-                        <a:off x="0" y="0"/>
-                        <a:ext cx="5734050" cy="1628775"/>
-                      </a:xfrm>
-                      <a:prstGeom prst="rect">
-                        <a:avLst/>
-                      </a:prstGeom>
-                    </pic:spPr>
-                  </pic:pic>
-                </a:graphicData>
-              </a:graphic>
-            </wp:inline>
-          </w:drawing>
-        </w:r>
-      </w:p>
+      <w:r>
+        <w:drawing>
+          <wp:inline distT="0" distB="0" distL="0" distR="0">
+            <wp:extent cx="4152900" cy="1181100"/>
+            <wp:effectExtent t="0" r="0" b="0" l="0"/>
+            <wp:docPr id="1" name="Minion" descr="Minion" title="Minion"/>
+            <wp:cNvGraphicFramePr>
+              <a:graphicFrameLocks xmlns:a="http://schemas.openxmlformats.org/drawingml/2006/main" noChangeAspect="1"/>
+            </wp:cNvGraphicFramePr>
+            <a:graphic xmlns:a="http://schemas.openxmlformats.org/drawingml/2006/main">
+              <a:graphicData uri="http://schemas.openxmlformats.org/drawingml/2006/picture">
+                <pic:pic xmlns:pic="http://schemas.openxmlformats.org/drawingml/2006/picture">
+                  <pic:nvPicPr>
+                    <pic:cNvPr id="0" name="" descr=""/>
+                    <pic:cNvPicPr>
+                      <a:picLocks noChangeAspect="1" noChangeArrowheads="1"/>
+                    </pic:cNvPicPr>
+                  </pic:nvPicPr>
+                  <pic:blipFill>
+                    <a:blip r:embed="rId7" cstate="none"/>
+                    <a:srcRect/>
+                    <a:stretch>
+                      <a:fillRect/>
+                    </a:stretch>
+                  </pic:blipFill>
+                  <pic:spPr bwMode="auto">
+                    <a:xfrm>
+                      <a:off x="0" y="0"/>
+                      <a:ext cx="4152900" cy="1181100"/>
+                    </a:xfrm>
+                    <a:prstGeom prst="rect">
+                      <a:avLst/>
+                    </a:prstGeom>
+                  </pic:spPr>
+                </pic:pic>
+              </a:graphicData>
+            </a:graphic>
+          </wp:inline>
+        </w:drawing>
+      </w:r>
       <w:r>
         <w:t xml:space="preserve">
 </w:t>
       </w:r>
-      <w:p>
-        <w:pPr>
-          <w:jc w:val="center"/>
-        </w:pPr>
-        <w:r>
-          <w:drawing>
-            <wp:inline distT="0" distB="0" distL="0" distR="0">
-              <wp:extent cx="5734050" cy="5734050"/>
-              <wp:effectExtent t="0" r="0" b="0" l="0"/>
-              <wp:docPr id="1" name="Stormtroopocat" descr="Stormtroopocat" title="The Stormtroopocat"/>
-              <wp:cNvGraphicFramePr>
-                <a:graphicFrameLocks xmlns:a="http://schemas.openxmlformats.org/drawingml/2006/main" noChangeAspect="1"/>
-              </wp:cNvGraphicFramePr>
-              <a:graphic xmlns:a="http://schemas.openxmlformats.org/drawingml/2006/main">
-                <a:graphicData uri="http://schemas.openxmlformats.org/drawingml/2006/picture">
-                  <pic:pic xmlns:pic="http://schemas.openxmlformats.org/drawingml/2006/picture">
-                    <pic:nvPicPr>
-                      <pic:cNvPr id="0" name="" descr=""/>
-                      <pic:cNvPicPr>
-                        <a:picLocks noChangeAspect="1" noChangeArrowheads="1"/>
-                      </pic:cNvPicPr>
-                    </pic:nvPicPr>
-                    <pic:blipFill>
-                      <a:blip r:embed="rId8" cstate="none"/>
-                      <a:srcRect/>
-                      <a:stretch>
-                        <a:fillRect/>
-                      </a:stretch>
-                    </pic:blipFill>
-                    <pic:spPr bwMode="auto">
-                      <a:xfrm>
-                        <a:off x="0" y="0"/>
-                        <a:ext cx="5734050" cy="5734050"/>
-                      </a:xfrm>
-                      <a:prstGeom prst="rect">
-                        <a:avLst/>
-                      </a:prstGeom>
-                    </pic:spPr>
-                  </pic:pic>
-                </a:graphicData>
-              </a:graphic>
-            </wp:inline>
-          </w:drawing>
-        </w:r>
-      </w:p>
+      <w:r>
+        <w:drawing>
+          <wp:inline distT="0" distB="0" distL="0" distR="0">
+            <wp:extent cx="1066800" cy="1066800"/>
+            <wp:effectExtent t="0" r="0" b="0" l="0"/>
+            <wp:docPr id="1" name="Stormtroopocat" descr="Stormtroopocat" title="The Stormtroopocat"/>
+            <wp:cNvGraphicFramePr>
+              <a:graphicFrameLocks xmlns:a="http://schemas.openxmlformats.org/drawingml/2006/main" noChangeAspect="1"/>
+            </wp:cNvGraphicFramePr>
+            <a:graphic xmlns:a="http://schemas.openxmlformats.org/drawingml/2006/main">
+              <a:graphicData uri="http://schemas.openxmlformats.org/drawingml/2006/picture">
+                <pic:pic xmlns:pic="http://schemas.openxmlformats.org/drawingml/2006/picture">
+                  <pic:nvPicPr>
+                    <pic:cNvPr id="0" name="" descr=""/>
+                    <pic:cNvPicPr>
+                      <a:picLocks noChangeAspect="1" noChangeArrowheads="1"/>
+                    </pic:cNvPicPr>
+                  </pic:nvPicPr>
+                  <pic:blipFill>
+                    <a:blip r:embed="rId8" cstate="none"/>
+                    <a:srcRect/>
+                    <a:stretch>
+                      <a:fillRect/>
+                    </a:stretch>
+                  </pic:blipFill>
+                  <pic:spPr bwMode="auto">
+                    <a:xfrm>
+                      <a:off x="0" y="0"/>
+                      <a:ext cx="1066800" cy="1066800"/>
+                    </a:xfrm>
+                    <a:prstGeom prst="rect">
+                      <a:avLst/>
+                    </a:prstGeom>
+                  </pic:spPr>
+                </pic:pic>
+              </a:graphicData>
+            </a:graphic>
+          </wp:inline>
+        </w:drawing>
+      </w:r>
     </w:p>
     <w:p>
       <w:pPr>
@@ -1589,51 +1569,46 @@
       <w:pPr>
         <w:pStyle w:val="MdParagraph"/>
       </w:pPr>
-      <w:p>
-        <w:pPr>
-          <w:jc w:val="center"/>
-        </w:pPr>
-        <w:r>
-          <w:drawing>
-            <wp:inline distT="0" distB="0" distL="0" distR="0">
-              <wp:extent cx="5734050" cy="5734050"/>
-              <wp:effectExtent t="0" r="0" b="0" l="0"/>
-              <wp:docPr id="1" name="Alt text" descr="Alt text" title="The Dojocat"/>
-              <wp:cNvGraphicFramePr>
-                <a:graphicFrameLocks xmlns:a="http://schemas.openxmlformats.org/drawingml/2006/main" noChangeAspect="1"/>
-              </wp:cNvGraphicFramePr>
-              <a:graphic xmlns:a="http://schemas.openxmlformats.org/drawingml/2006/main">
-                <a:graphicData uri="http://schemas.openxmlformats.org/drawingml/2006/picture">
-                  <pic:pic xmlns:pic="http://schemas.openxmlformats.org/drawingml/2006/picture">
-                    <pic:nvPicPr>
-                      <pic:cNvPr id="0" name="" descr=""/>
-                      <pic:cNvPicPr>
-                        <a:picLocks noChangeAspect="1" noChangeArrowheads="1"/>
-                      </pic:cNvPicPr>
-                    </pic:nvPicPr>
-                    <pic:blipFill>
-                      <a:blip r:embed="rId8" cstate="none"/>
-                      <a:srcRect/>
-                      <a:stretch>
-                        <a:fillRect/>
-                      </a:stretch>
-                    </pic:blipFill>
-                    <pic:spPr bwMode="auto">
-                      <a:xfrm>
-                        <a:off x="0" y="0"/>
-                        <a:ext cx="5734050" cy="5734050"/>
-                      </a:xfrm>
-                      <a:prstGeom prst="rect">
-                        <a:avLst/>
-                      </a:prstGeom>
-                    </pic:spPr>
-                  </pic:pic>
-                </a:graphicData>
-              </a:graphic>
-            </wp:inline>
-          </w:drawing>
-        </w:r>
-      </w:p>
+      <w:r>
+        <w:drawing>
+          <wp:inline distT="0" distB="0" distL="0" distR="0">
+            <wp:extent cx="1066800" cy="1066800"/>
+            <wp:effectExtent t="0" r="0" b="0" l="0"/>
+            <wp:docPr id="1" name="Alt text" descr="Alt text" title="The Dojocat"/>
+            <wp:cNvGraphicFramePr>
+              <a:graphicFrameLocks xmlns:a="http://schemas.openxmlformats.org/drawingml/2006/main" noChangeAspect="1"/>
+            </wp:cNvGraphicFramePr>
+            <a:graphic xmlns:a="http://schemas.openxmlformats.org/drawingml/2006/main">
+              <a:graphicData uri="http://schemas.openxmlformats.org/drawingml/2006/picture">
+                <pic:pic xmlns:pic="http://schemas.openxmlformats.org/drawingml/2006/picture">
+                  <pic:nvPicPr>
+                    <pic:cNvPr id="0" name="" descr=""/>
+                    <pic:cNvPicPr>
+                      <a:picLocks noChangeAspect="1" noChangeArrowheads="1"/>
+                    </pic:cNvPicPr>
+                  </pic:nvPicPr>
+                  <pic:blipFill>
+                    <a:blip r:embed="rId8" cstate="none"/>
+                    <a:srcRect/>
+                    <a:stretch>
+                      <a:fillRect/>
+                    </a:stretch>
+                  </pic:blipFill>
+                  <pic:spPr bwMode="auto">
+                    <a:xfrm>
+                      <a:off x="0" y="0"/>
+                      <a:ext cx="1066800" cy="1066800"/>
+                    </a:xfrm>
+                    <a:prstGeom prst="rect">
+                      <a:avLst/>
+                    </a:prstGeom>
+                  </pic:spPr>
+                </pic:pic>
+              </a:graphicData>
+            </a:graphic>
+          </wp:inline>
+        </w:drawing>
+      </w:r>
     </w:p>
     <w:p>
       <w:pPr>
@@ -1675,51 +1650,46 @@
       <w:pPr>
         <w:pStyle w:val="MdParagraph"/>
       </w:pPr>
-      <w:p>
-        <w:pPr>
-          <w:jc w:val="center"/>
-        </w:pPr>
-        <w:r>
-          <w:drawing>
-            <wp:inline distT="0" distB="0" distL="0" distR="0">
-              <wp:extent cx="476250" cy="476250"/>
-              <wp:effectExtent t="0" r="0" b="0" l="0"/>
-              <wp:docPr id="1" name="Alt text" descr="Alt text" title="Alt text"/>
-              <wp:cNvGraphicFramePr>
-                <a:graphicFrameLocks xmlns:a="http://schemas.openxmlformats.org/drawingml/2006/main" noChangeAspect="1"/>
-              </wp:cNvGraphicFramePr>
-              <a:graphic xmlns:a="http://schemas.openxmlformats.org/drawingml/2006/main">
-                <a:graphicData uri="http://schemas.openxmlformats.org/drawingml/2006/picture">
-                  <pic:pic xmlns:pic="http://schemas.openxmlformats.org/drawingml/2006/picture">
-                    <pic:nvPicPr>
-                      <pic:cNvPr id="0" name="" descr=""/>
-                      <pic:cNvPicPr>
-                        <a:picLocks noChangeAspect="1" noChangeArrowheads="1"/>
-                      </pic:cNvPicPr>
-                    </pic:nvPicPr>
-                    <pic:blipFill>
-                      <a:blip r:embed="rId6" cstate="none"/>
-                      <a:srcRect/>
-                      <a:stretch>
-                        <a:fillRect/>
-                      </a:stretch>
-                    </pic:blipFill>
-                    <pic:spPr bwMode="auto">
-                      <a:xfrm>
-                        <a:off x="0" y="0"/>
-                        <a:ext cx="476250" cy="476250"/>
-                      </a:xfrm>
-                      <a:prstGeom prst="rect">
-                        <a:avLst/>
-                      </a:prstGeom>
-                    </pic:spPr>
-                  </pic:pic>
-                </a:graphicData>
-              </a:graphic>
-            </wp:inline>
-          </w:drawing>
-        </w:r>
-      </w:p>
+      <w:r>
+        <w:drawing>
+          <wp:inline distT="0" distB="0" distL="0" distR="0">
+            <wp:extent cx="476250" cy="476250"/>
+            <wp:effectExtent t="0" r="0" b="0" l="0"/>
+            <wp:docPr id="1" name="Alt text" descr="Alt text" title="Alt text"/>
+            <wp:cNvGraphicFramePr>
+              <a:graphicFrameLocks xmlns:a="http://schemas.openxmlformats.org/drawingml/2006/main" noChangeAspect="1"/>
+            </wp:cNvGraphicFramePr>
+            <a:graphic xmlns:a="http://schemas.openxmlformats.org/drawingml/2006/main">
+              <a:graphicData uri="http://schemas.openxmlformats.org/drawingml/2006/picture">
+                <pic:pic xmlns:pic="http://schemas.openxmlformats.org/drawingml/2006/picture">
+                  <pic:nvPicPr>
+                    <pic:cNvPr id="0" name="" descr=""/>
+                    <pic:cNvPicPr>
+                      <a:picLocks noChangeAspect="1" noChangeArrowheads="1"/>
+                    </pic:cNvPicPr>
+                  </pic:nvPicPr>
+                  <pic:blipFill>
+                    <a:blip r:embed="rId6" cstate="none"/>
+                    <a:srcRect/>
+                    <a:stretch>
+                      <a:fillRect/>
+                    </a:stretch>
+                  </pic:blipFill>
+                  <pic:spPr bwMode="auto">
+                    <a:xfrm>
+                      <a:off x="0" y="0"/>
+                      <a:ext cx="476250" cy="476250"/>
+                    </a:xfrm>
+                    <a:prstGeom prst="rect">
+                      <a:avLst/>
+                    </a:prstGeom>
+                  </pic:spPr>
+                </pic:pic>
+              </a:graphicData>
+            </a:graphic>
+          </wp:inline>
+        </w:drawing>
+      </w:r>
     </w:p>
     <w:p>
       <w:pPr>
@@ -1731,58 +1701,53 @@
         <w:pStyle w:val="Heading2"/>
         <w:pStyle w:val="MdHeading2"/>
       </w:pPr>
-      <w:p>
-        <w:pPr>
-          <w:jc w:val="center"/>
-        </w:pPr>
-        <w:r>
-          <w:drawing>
-            <wp:inline distT="0" distB="0" distL="0" distR="0">
-              <wp:extent cx="198120" cy="240030"/>
-              <wp:effectExtent t="0" r="0" b="0" l="0"/>
-              <wp:docPr id="1" name="Alt text" descr="Alt text" title="Alt text"/>
-              <wp:cNvGraphicFramePr>
-                <a:graphicFrameLocks xmlns:a="http://schemas.openxmlformats.org/drawingml/2006/main" noChangeAspect="1"/>
-              </wp:cNvGraphicFramePr>
-              <a:graphic xmlns:a="http://schemas.openxmlformats.org/drawingml/2006/main">
-                <a:graphicData uri="http://schemas.openxmlformats.org/drawingml/2006/picture">
-                  <pic:pic xmlns:pic="http://schemas.openxmlformats.org/drawingml/2006/picture">
-                    <pic:nvPicPr>
-                      <pic:cNvPr id="0" name="" descr=""/>
-                      <pic:cNvPicPr>
-                        <a:picLocks noChangeAspect="1" noChangeArrowheads="1"/>
-                      </pic:cNvPicPr>
-                    </pic:nvPicPr>
-                    <pic:blipFill>
-                      <a:blip r:embed="rId6" cstate="none"/>
-                      <a:srcRect/>
-                      <a:stretch>
-                        <a:fillRect/>
-                      </a:stretch>
-                    </pic:blipFill>
-                    <pic:spPr bwMode="auto">
-                      <a:xfrm>
-                        <a:off x="0" y="0"/>
-                        <a:ext cx="198120" cy="240030"/>
-                      </a:xfrm>
-                      <a:prstGeom prst="rect">
-                        <a:avLst/>
-                      </a:prstGeom>
-                    </pic:spPr>
-                  </pic:pic>
-                </a:graphicData>
-              </a:graphic>
-            </wp:inline>
-          </w:drawing>
-        </w:r>
-      </w:p>
+      <w:r>
+        <w:drawing>
+          <wp:inline distT="0" distB="0" distL="0" distR="0">
+            <wp:extent cx="198120" cy="240030"/>
+            <wp:effectExtent t="0" r="0" b="0" l="0"/>
+            <wp:docPr id="1" name="Alt text" descr="Alt text" title="Alt text"/>
+            <wp:cNvGraphicFramePr>
+              <a:graphicFrameLocks xmlns:a="http://schemas.openxmlformats.org/drawingml/2006/main" noChangeAspect="1"/>
+            </wp:cNvGraphicFramePr>
+            <a:graphic xmlns:a="http://schemas.openxmlformats.org/drawingml/2006/main">
+              <a:graphicData uri="http://schemas.openxmlformats.org/drawingml/2006/picture">
+                <pic:pic xmlns:pic="http://schemas.openxmlformats.org/drawingml/2006/picture">
+                  <pic:nvPicPr>
+                    <pic:cNvPr id="0" name="" descr=""/>
+                    <pic:cNvPicPr>
+                      <a:picLocks noChangeAspect="1" noChangeArrowheads="1"/>
+                    </pic:cNvPicPr>
+                  </pic:nvPicPr>
+                  <pic:blipFill>
+                    <a:blip r:embed="rId6" cstate="none"/>
+                    <a:srcRect/>
+                    <a:stretch>
+                      <a:fillRect/>
+                    </a:stretch>
+                  </pic:blipFill>
+                  <pic:spPr bwMode="auto">
+                    <a:xfrm>
+                      <a:off x="0" y="0"/>
+                      <a:ext cx="198120" cy="240030"/>
+                    </a:xfrm>
+                    <a:prstGeom prst="rect">
+                      <a:avLst/>
+                    </a:prstGeom>
+                  </pic:spPr>
+                </pic:pic>
+              </a:graphicData>
+            </a:graphic>
+          </wp:inline>
+        </w:drawing>
+      </w:r>
     </w:p>
     <w:p>
       <w:pPr>
         <w:pStyle w:val="Heading1"/>
         <w:pStyle w:val="MdHeading1"/>
       </w:pPr>
-      <w:hyperlink w:history="1" r:id="rIdbmd9qtzd4i4cpg2ak8vjv">
+      <w:hyperlink w:history="1" r:id="rIdttu0pmsrrq-qgzw2tfylt">
         <w:r>
           <w:rPr>
             <w:rStyle w:val="MdLink"/>
@@ -2687,51 +2652,46 @@
             <w:pPr>
               <w:pStyle w:val="MdTableCell"/>
             </w:pPr>
-            <w:p>
-              <w:pPr>
-                <w:jc w:val="center"/>
-              </w:pPr>
-              <w:r>
-                <w:drawing>
-                  <wp:inline distT="0" distB="0" distL="0" distR="0">
-                    <wp:extent cx="5734050" cy="6943725"/>
-                    <wp:effectExtent t="0" r="0" b="0" l="0"/>
-                    <wp:docPr id="1" name="alt text" descr="alt text" title="Logo Title Text 1"/>
-                    <wp:cNvGraphicFramePr>
-                      <a:graphicFrameLocks xmlns:a="http://schemas.openxmlformats.org/drawingml/2006/main" noChangeAspect="1"/>
-                    </wp:cNvGraphicFramePr>
-                    <a:graphic xmlns:a="http://schemas.openxmlformats.org/drawingml/2006/main">
-                      <a:graphicData uri="http://schemas.openxmlformats.org/drawingml/2006/picture">
-                        <pic:pic xmlns:pic="http://schemas.openxmlformats.org/drawingml/2006/picture">
-                          <pic:nvPicPr>
-                            <pic:cNvPr id="0" name="" descr=""/>
-                            <pic:cNvPicPr>
-                              <a:picLocks noChangeAspect="1" noChangeArrowheads="1"/>
-                            </pic:cNvPicPr>
-                          </pic:nvPicPr>
-                          <pic:blipFill>
-                            <a:blip r:embed="rId6" cstate="none"/>
-                            <a:srcRect/>
-                            <a:stretch>
-                              <a:fillRect/>
-                            </a:stretch>
-                          </pic:blipFill>
-                          <pic:spPr bwMode="auto">
-                            <a:xfrm>
-                              <a:off x="0" y="0"/>
-                              <a:ext cx="5734050" cy="6943725"/>
-                            </a:xfrm>
-                            <a:prstGeom prst="rect">
-                              <a:avLst/>
-                            </a:prstGeom>
-                          </pic:spPr>
-                        </pic:pic>
-                      </a:graphicData>
-                    </a:graphic>
-                  </wp:inline>
-                </w:drawing>
-              </w:r>
-            </w:p>
+            <w:r>
+              <w:drawing>
+                <wp:inline distT="0" distB="0" distL="0" distR="0">
+                  <wp:extent cx="990600" cy="1200150"/>
+                  <wp:effectExtent t="0" r="0" b="0" l="0"/>
+                  <wp:docPr id="1" name="alt text" descr="alt text" title="Logo Title Text 1"/>
+                  <wp:cNvGraphicFramePr>
+                    <a:graphicFrameLocks xmlns:a="http://schemas.openxmlformats.org/drawingml/2006/main" noChangeAspect="1"/>
+                  </wp:cNvGraphicFramePr>
+                  <a:graphic xmlns:a="http://schemas.openxmlformats.org/drawingml/2006/main">
+                    <a:graphicData uri="http://schemas.openxmlformats.org/drawingml/2006/picture">
+                      <pic:pic xmlns:pic="http://schemas.openxmlformats.org/drawingml/2006/picture">
+                        <pic:nvPicPr>
+                          <pic:cNvPr id="0" name="" descr=""/>
+                          <pic:cNvPicPr>
+                            <a:picLocks noChangeAspect="1" noChangeArrowheads="1"/>
+                          </pic:cNvPicPr>
+                        </pic:nvPicPr>
+                        <pic:blipFill>
+                          <a:blip r:embed="rId6" cstate="none"/>
+                          <a:srcRect/>
+                          <a:stretch>
+                            <a:fillRect/>
+                          </a:stretch>
+                        </pic:blipFill>
+                        <pic:spPr bwMode="auto">
+                          <a:xfrm>
+                            <a:off x="0" y="0"/>
+                            <a:ext cx="990600" cy="1200150"/>
+                          </a:xfrm>
+                          <a:prstGeom prst="rect">
+                            <a:avLst/>
+                          </a:prstGeom>
+                        </pic:spPr>
+                      </pic:pic>
+                    </a:graphicData>
+                  </a:graphic>
+                </wp:inline>
+              </w:drawing>
+            </w:r>
           </w:p>
         </w:tc>
         <w:tc>
@@ -3933,7 +3893,6 @@
   <w:docDefaults>
     <w:rPrDefault>
       <w:rPr>
-        <w:rFonts w:ascii="Times New Roman" w:cs="Times New Roman" w:eastAsia="Times New Roman" w:hAnsi="Times New Roman"/>
         <w:sz w:val="24"/>
         <w:szCs w:val="24"/>
       </w:rPr>
@@ -3965,12 +3924,11 @@
       <w:outlineLvl w:val="0"/>
     </w:pPr>
     <w:rPr>
-      <w:rFonts w:ascii="Arial" w:cs="Arial" w:eastAsia="Arial" w:hAnsi="Arial"/>
       <w:b/>
       <w:bCs/>
-      <w:color w:val="5B21B6"/>
-      <w:sz w:val="132"/>
-      <w:szCs w:val="132"/>
+      <w:color w:val="2F5597"/>
+      <w:sz w:val="36"/>
+      <w:szCs w:val="36"/>
     </w:rPr>
   </w:style>
   <w:style w:type="paragraph" w:styleId="Heading2">
@@ -3984,12 +3942,11 @@
       <w:outlineLvl w:val="1"/>
     </w:pPr>
     <w:rPr>
-      <w:rFonts w:ascii="Arial" w:cs="Arial" w:eastAsia="Arial" w:hAnsi="Arial"/>
       <w:b/>
       <w:bCs/>
-      <w:color w:val="7C3AED"/>
-      <w:sz w:val="104"/>
-      <w:szCs w:val="104"/>
+      <w:color w:val="5B9BD5"/>
+      <w:sz w:val="32"/>
+      <w:szCs w:val="32"/>
     </w:rPr>
   </w:style>
   <w:style w:type="paragraph" w:styleId="Heading3">
@@ -4003,12 +3960,11 @@
       <w:outlineLvl w:val="2"/>
     </w:pPr>
     <w:rPr>
-      <w:rFonts w:ascii="Arial" w:cs="Arial" w:eastAsia="Arial" w:hAnsi="Arial"/>
       <w:b/>
       <w:bCs/>
-      <w:color w:val="8B5CF6"/>
-      <w:sz w:val="84"/>
-      <w:szCs w:val="84"/>
+      <w:color w:val="44546A"/>
+      <w:sz w:val="28"/>
+      <w:szCs w:val="28"/>
     </w:rPr>
   </w:style>
   <w:style w:type="paragraph" w:styleId="Heading4">
@@ -4022,10 +3978,9 @@
       <w:outlineLvl w:val="3"/>
     </w:pPr>
     <w:rPr>
-      <w:rFonts w:ascii="Arial" w:cs="Arial" w:eastAsia="Arial" w:hAnsi="Arial"/>
       <w:b/>
       <w:bCs/>
-      <w:color w:val="374151"/>
+      <w:color w:val="44546A"/>
       <w:sz w:val="26"/>
       <w:szCs w:val="26"/>
     </w:rPr>
@@ -4041,12 +3996,11 @@
       <w:outlineLvl w:val="4"/>
     </w:pPr>
     <w:rPr>
-      <w:rFonts w:ascii="Arial" w:cs="Arial" w:eastAsia="Arial" w:hAnsi="Arial"/>
       <w:b/>
       <w:bCs/>
       <w:i/>
       <w:iCs/>
-      <w:color w:val="374151"/>
+      <w:color w:val="44546A"/>
       <w:sz w:val="24"/>
       <w:szCs w:val="24"/>
     </w:rPr>
@@ -4062,12 +4016,11 @@
       <w:outlineLvl w:val="5"/>
     </w:pPr>
     <w:rPr>
-      <w:rFonts w:ascii="Arial" w:cs="Arial" w:eastAsia="Arial" w:hAnsi="Arial"/>
       <w:b w:val="false"/>
       <w:bCs w:val="false"/>
       <w:i/>
       <w:iCs/>
-      <w:color w:val="374151"/>
+      <w:color w:val="44546A"/>
       <w:sz w:val="24"/>
       <w:szCs w:val="24"/>
     </w:rPr>
@@ -4143,8 +4096,8 @@
       <w:spacing w:before="0" w:after="0"/>
     </w:pPr>
     <w:rPr>
-      <w:sz w:val="36"/>
-      <w:szCs w:val="36"/>
+      <w:sz w:val="12"/>
+      <w:szCs w:val="12"/>
     </w:rPr>
   </w:style>
   <w:style w:type="paragraph" w:styleId="MdCode">
@@ -4163,10 +4116,10 @@
       <w:spacing w:before="200" w:after="200"/>
     </w:pPr>
     <w:rPr>
-      <w:rFonts w:ascii="Fira Code" w:cs="Fira Code" w:eastAsia="Fira Code" w:hAnsi="Fira Code"/>
-      <w:color w:val="EC4899"/>
-      <w:sz w:val="40"/>
-      <w:szCs w:val="40"/>
+      <w:rFonts w:ascii="Courier New" w:cs="Courier New" w:eastAsia="Courier New" w:hAnsi="Courier New"/>
+      <w:color w:val="032F62"/>
+      <w:sz w:val="22"/>
+      <w:szCs w:val="22"/>
     </w:rPr>
   </w:style>
   <w:style w:type="paragraph" w:styleId="MdHr">
@@ -4188,17 +4141,16 @@
     <w:qFormat/>
     <w:pPr>
       <w:pBdr>
-        <w:left w:val="single" w:color="6B7280" w:sz="20" w:space="12"/>
+        <w:left w:val="single" w:color="666666" w:sz="20" w:space="12"/>
       </w:pBdr>
       <w:shd w:fill="F9F9F9"/>
       <w:spacing w:before="200" w:after="200"/>
       <w:ind w:left="360"/>
     </w:pPr>
     <w:rPr>
-      <w:rFonts w:ascii="Georgia" w:cs="Georgia" w:eastAsia="Georgia" w:hAnsi="Georgia"/>
       <w:i/>
       <w:iCs/>
-      <w:color w:val="6B7280"/>
+      <w:color w:val="666666"/>
     </w:rPr>
   </w:style>
   <w:style w:type="paragraph" w:styleId="MdHtml">
@@ -4207,7 +4159,7 @@
     <w:next w:val="Normal"/>
     <w:qFormat/>
     <w:rPr>
-      <w:rFonts w:ascii="Fira Code" w:cs="Fira Code" w:eastAsia="Fira Code" w:hAnsi="Fira Code"/>
+      <w:rFonts w:ascii="Courier New" w:cs="Courier New" w:eastAsia="Courier New" w:hAnsi="Courier New"/>
       <w:color w:val="4472C4"/>
     </w:rPr>
   </w:style>
@@ -4290,12 +4242,11 @@
       <w:outlineLvl w:val="0"/>
     </w:pPr>
     <w:rPr>
-      <w:rFonts w:ascii="Arial" w:cs="Arial" w:eastAsia="Arial" w:hAnsi="Arial"/>
       <w:b/>
       <w:bCs/>
-      <w:color w:val="5B21B6"/>
-      <w:sz w:val="132"/>
-      <w:szCs w:val="132"/>
+      <w:color w:val="2F5597"/>
+      <w:sz w:val="36"/>
+      <w:szCs w:val="36"/>
     </w:rPr>
   </w:style>
   <w:style w:type="paragraph" w:styleId="MdHeading2">
@@ -4309,12 +4260,11 @@
       <w:outlineLvl w:val="1"/>
     </w:pPr>
     <w:rPr>
-      <w:rFonts w:ascii="Arial" w:cs="Arial" w:eastAsia="Arial" w:hAnsi="Arial"/>
       <w:b/>
       <w:bCs/>
-      <w:color w:val="7C3AED"/>
-      <w:sz w:val="104"/>
-      <w:szCs w:val="104"/>
+      <w:color w:val="5B9BD5"/>
+      <w:sz w:val="32"/>
+      <w:szCs w:val="32"/>
     </w:rPr>
   </w:style>
   <w:style w:type="paragraph" w:styleId="MdHeading3">
@@ -4328,12 +4278,11 @@
       <w:outlineLvl w:val="2"/>
     </w:pPr>
     <w:rPr>
-      <w:rFonts w:ascii="Arial" w:cs="Arial" w:eastAsia="Arial" w:hAnsi="Arial"/>
       <w:b/>
       <w:bCs/>
-      <w:color w:val="8B5CF6"/>
-      <w:sz w:val="84"/>
-      <w:szCs w:val="84"/>
+      <w:color w:val="44546A"/>
+      <w:sz w:val="28"/>
+      <w:szCs w:val="28"/>
     </w:rPr>
   </w:style>
   <w:style w:type="paragraph" w:styleId="MdHeading4">
@@ -4347,10 +4296,9 @@
       <w:outlineLvl w:val="3"/>
     </w:pPr>
     <w:rPr>
-      <w:rFonts w:ascii="Arial" w:cs="Arial" w:eastAsia="Arial" w:hAnsi="Arial"/>
       <w:b/>
       <w:bCs/>
-      <w:color w:val="374151"/>
+      <w:color w:val="44546A"/>
       <w:sz w:val="26"/>
       <w:szCs w:val="26"/>
     </w:rPr>
@@ -4366,12 +4314,11 @@
       <w:outlineLvl w:val="4"/>
     </w:pPr>
     <w:rPr>
-      <w:rFonts w:ascii="Arial" w:cs="Arial" w:eastAsia="Arial" w:hAnsi="Arial"/>
       <w:b/>
       <w:bCs/>
       <w:i/>
       <w:iCs/>
-      <w:color w:val="374151"/>
+      <w:color w:val="44546A"/>
       <w:sz w:val="24"/>
       <w:szCs w:val="24"/>
     </w:rPr>
@@ -4387,12 +4334,11 @@
       <w:outlineLvl w:val="5"/>
     </w:pPr>
     <w:rPr>
-      <w:rFonts w:ascii="Arial" w:cs="Arial" w:eastAsia="Arial" w:hAnsi="Arial"/>
       <w:b w:val="false"/>
       <w:bCs w:val="false"/>
       <w:i/>
       <w:iCs/>
-      <w:color w:val="374151"/>
+      <w:color w:val="44546A"/>
       <w:sz w:val="24"/>
       <w:szCs w:val="24"/>
     </w:rPr>
@@ -4405,7 +4351,7 @@
     <w:unhideWhenUsed/>
     <w:qFormat/>
     <w:rPr>
-      <w:rFonts w:ascii="Fira Code" w:cs="Fira Code" w:eastAsia="Fira Code" w:hAnsi="Fira Code"/>
+      <w:rFonts w:ascii="Courier New" w:cs="Courier New" w:eastAsia="Courier New" w:hAnsi="Courier New"/>
       <w:color w:val="ED7D31"/>
     </w:rPr>
   </w:style>
@@ -4417,7 +4363,8 @@
     <w:unhideWhenUsed/>
     <w:qFormat/>
     <w:rPr>
-      <w:color w:val="00fb0a"/>
+      <w:color w:val="0563C1"/>
+      <w:u w:val="single"/>
     </w:rPr>
   </w:style>
   <w:style w:type="character" w:styleId="MdStrong">
@@ -4452,7 +4399,7 @@
     <w:unhideWhenUsed/>
     <w:qFormat/>
     <w:rPr>
-      <w:rFonts w:ascii="Fira Code" w:cs="Fira Code" w:eastAsia="Fira Code" w:hAnsi="Fira Code"/>
+      <w:rFonts w:ascii="Courier New" w:cs="Courier New" w:eastAsia="Courier New" w:hAnsi="Courier New"/>
       <w:color w:val="70AD47"/>
     </w:rPr>
   </w:style>
@@ -4465,7 +4412,7 @@
     <w:qFormat/>
     <w:rPr>
       <w:strike/>
-      <w:color w:val="EF4444"/>
+      <w:color w:val="FF0000"/>
     </w:rPr>
   </w:style>
   <w:style w:type="character" w:styleId="MdBr">

</xml_diff>

<commit_message>
fix: use orignal image size if size is not positive when scale
</commit_message>
<xml_diff>
--- a/tests/markdown.docx
+++ b/tests/markdown.docx
@@ -927,7 +927,7 @@
       <w:r>
         <w:t xml:space="preserve">@mentions, #refs, </w:t>
       </w:r>
-      <w:hyperlink w:history="1" r:id="rIdvqgajkq3ji3fxv5_eqm-w">
+      <w:hyperlink w:history="1" r:id="rIdevqok8_wsjzd-albhdoo0">
         <w:r>
           <w:rPr>
             <w:rStyle w:val="MdLink"/>
@@ -1152,7 +1152,7 @@
       <w:pPr>
         <w:pStyle w:val="MdParagraph"/>
       </w:pPr>
-      <w:hyperlink w:history="1" r:id="rIdxppvuqvg1j5dnpo7mhift">
+      <w:hyperlink w:history="1" r:id="rIdls8gc3rb1keoq4nsf6-yl">
         <w:r>
           <w:rPr>
             <w:rStyle w:val="MdLink"/>
@@ -1170,7 +1170,7 @@
       <w:pPr>
         <w:pStyle w:val="MdParagraph"/>
       </w:pPr>
-      <w:hyperlink w:history="1" r:id="rIdlkorp3pwo41bj_xrmhmrw">
+      <w:hyperlink w:history="1" r:id="rIdmv5ruaejj8ns7dknivsnm">
         <w:r>
           <w:rPr>
             <w:rStyle w:val="MdLink"/>
@@ -1188,7 +1188,7 @@
       <w:pPr>
         <w:pStyle w:val="MdParagraph"/>
       </w:pPr>
-      <w:hyperlink w:history="1" r:id="rIdidmhvansoupm7zbphjkjh">
+      <w:hyperlink w:history="1" r:id="rIddk8z6g4npiap5mv08wuh-">
         <w:r>
           <w:rPr>
             <w:rStyle w:val="MdLink"/>
@@ -1206,7 +1206,7 @@
       <w:pPr>
         <w:pStyle w:val="MdParagraph"/>
       </w:pPr>
-      <w:hyperlink w:history="1" r:id="rIdebj8p5h5xn9ufsoeps2db">
+      <w:hyperlink w:history="1" r:id="rIdi8tupmdp4uxbmpiwrnqjh">
         <w:r>
           <w:rPr>
             <w:rStyle w:val="MdLink"/>
@@ -1224,7 +1224,7 @@
       <w:pPr>
         <w:pStyle w:val="MdParagraph"/>
       </w:pPr>
-      <w:hyperlink w:history="1" r:id="rIdkjxqktsbabyexy-gigxda">
+      <w:hyperlink w:history="1" r:id="rId6vofimv_2jsiijidi_wli">
         <w:r>
           <w:rPr>
             <w:rStyle w:val="MdLink"/>
@@ -1245,7 +1245,7 @@
       <w:r>
         <w:t xml:space="preserve">Or leave it empty and use the </w:t>
       </w:r>
-      <w:hyperlink w:history="1" r:id="rId5xtyja4jycgswrsgyk7y8">
+      <w:hyperlink w:history="1" r:id="rIdrvhrw9v7yw-hrstbnm7ib">
         <w:r>
           <w:rPr>
             <w:rStyle w:val="MdLink"/>
@@ -1270,7 +1270,7 @@
         <w:t xml:space="preserve">URLs and URLs in angle brackets will automatically get turned into links.
 </w:t>
       </w:r>
-      <w:hyperlink w:history="1" r:id="rIdmz9hrikcg-9s_4uah6dgf">
+      <w:hyperlink w:history="1" r:id="rIdkaicwqw8_zzsw0zwftqts">
         <w:r>
           <w:rPr>
             <w:rStyle w:val="MdLink"/>
@@ -1281,7 +1281,7 @@
       <w:r>
         <w:t xml:space="preserve"> or </w:t>
       </w:r>
-      <w:hyperlink w:history="1" r:id="rIdkv5rgeuznbnoot3yw4lji">
+      <w:hyperlink w:history="1" r:id="rIddr3xh7xuoinyke_fot6ha">
         <w:r>
           <w:rPr>
             <w:rStyle w:val="MdLink"/>
@@ -1747,7 +1747,7 @@
         <w:pStyle w:val="Heading1"/>
         <w:pStyle w:val="MdHeading1"/>
       </w:pPr>
-      <w:hyperlink w:history="1" r:id="rIdttu0pmsrrq-qgzw2tfylt">
+      <w:hyperlink w:history="1" r:id="rIdv8wgrzil8q8qjirbjf2tg">
         <w:r>
           <w:rPr>
             <w:rStyle w:val="MdLink"/>

</xml_diff>